<commit_message>
Docs: aggiorna sez. 9.2/9.3 con colonna Competenza nelle tabelle fuori periodo/non allocate
</commit_message>
<xml_diff>
--- a/FamilyMoneyTracker_Instructions_v3.docx
+++ b/FamilyMoneyTracker_Instructions_v3.docx
@@ -13006,7 +13006,7 @@
           <w:sz w:val="20"/>
           <w:szCs w:val="20"/>
         </w:rPr>
-        <w:t xml:space="preserve">Tutti i grafici, KPI, Forecast e Satispay usano il campo competenza (mese di competenza economica), non la data valuta del CSV. La competenza è editabile inline nella tabella Transazioni. Default = data valuta. Questo permette di spostare una spesa di fine mese al mese corretto (es. bolletta di dicembre addebitata a gennaio).</w:t>
+        <w:t xml:space="preserve">Tutti i grafici, KPI, Forecast e Satispay usano il campo competenza (mese di competenza economica), non la data valuta del CSV. La competenza è editabile inline nella tabella Transazioni. Default = data valuta. Questo permette di spostare una spesa di fine mese al mese corretto (es. bolletta di dicembre addebitata a gennaio). Anche le tabelle di WeekendVacanzeV2Page (“📆 Spese fuori periodo” e “🚩 Spese non allocate”) usano la competenza — non la data valuta/contabile — per stabilire se una spesa cade dentro o fuori un periodo vacanza; è editabile anche lì (colonna Competenza).</w:t>
       </w:r>
     </w:p>
     <w:p>
@@ -13140,6 +13140,24 @@
           <w:szCs w:val="20"/>
         </w:rPr>
         <w:t xml:space="preserve">Per ogni viaggio: costo manuale (benzina, vitto, alloggio, altro) e/o costo AI dalle transazioni. Toggle "usa manuale / usa AI" per reportistica</w:t>
+      </w:r>
+    </w:p>
+    <w:p>
+      <w:pPr>
+        <w:pStyle w:val="ListParagraph"/>
+        <w:numPr>
+          <w:ilvl w:val="0"/>
+          <w:numId w:val="2"/>
+        </w:numPr>
+        <w:spacing w:after="36" w:before="36"/>
+      </w:pPr>
+      <w:r>
+        <w:rPr>
+          <w:rFonts w:ascii="Arial" w:cs="Arial" w:eastAsia="Arial" w:hAnsi="Arial"/>
+          <w:sz w:val="20"/>
+          <w:szCs w:val="20"/>
+        </w:rPr>
+        <w:t xml:space="preserve">Overlay “📆 Spese fuori periodo” / “🚩 Spese non allocate” (WeekendVacanzeV2Page): entrambe le tabelle mostrano ora anche la colonna “Competenza” (editabile) accanto a Data cont./Data valuta; il confronto con i periodi vacanza usa sempre competenza → data (mai la sola data valuta/contabile)</w:t>
       </w:r>
     </w:p>
     <w:p>

</xml_diff>

<commit_message>
Docs: aggiorna sez. 6.4 con filtro colonna Importo (ricerca importo esatto)
</commit_message>
<xml_diff>
--- a/FamilyMoneyTracker_Instructions_v3.docx
+++ b/FamilyMoneyTracker_Instructions_v3.docx
@@ -9286,6 +9286,24 @@
           <w:szCs w:val="20"/>
         </w:rPr>
         <w:t xml:space="preserve">Rimborsi parziali: costo netto = amount - reimbAmount. I grafici usano il netto</w:t>
+      </w:r>
+    </w:p>
+    <w:p>
+      <w:pPr>
+        <w:pStyle w:val="ListParagraph"/>
+        <w:numPr>
+          <w:ilvl w:val="0"/>
+          <w:numId w:val="2"/>
+        </w:numPr>
+        <w:spacing w:after="36" w:before="36"/>
+      </w:pPr>
+      <w:r>
+        <w:rPr>
+          <w:rFonts w:ascii="Arial" w:cs="Arial" w:eastAsia="Arial" w:hAnsi="Arial"/>
+          <w:sz w:val="20"/>
+          <w:szCs w:val="20"/>
+        </w:rPr>
+        <w:t xml:space="preserve">Filtro colonna stile Excel (▽ nell’header): disponibile su Data, AI Descrizione, Controparte, Merchant, Città, Carta, Utente, Categoria, Bonifico e (dal 2026-07-12) Importo — click apre un elenco di valori unici con ricerca testuale e checkbox multi-selezione; per Importo permette di trovare una spesa cercando il suo importo esatto (es. “45,00”), valori ordinati numericamente (non alfabeticamente) e confrontati sul valore assoluto formattato come in tabella</w:t>
       </w:r>
     </w:p>
     <w:p>

</xml_diff>

<commit_message>
Docs: aggiorna sez. 9.3 con selezione multipla, tasto MAI e pannello Escluse sempre in Spese non allocate
</commit_message>
<xml_diff>
--- a/FamilyMoneyTracker_Instructions_v3.docx
+++ b/FamilyMoneyTracker_Instructions_v3.docx
@@ -13176,6 +13176,24 @@
           <w:szCs w:val="20"/>
         </w:rPr>
         <w:t xml:space="preserve">Overlay “📆 Spese fuori periodo” / “🚩 Spese non allocate” (WeekendVacanzeV2Page): entrambe le tabelle mostrano ora anche la colonna “Competenza” (editabile) accanto a Data cont./Data valuta; il confronto con i periodi vacanza usa sempre competenza → data (mai la sola data valuta/contabile). In “📆 Spese fuori periodo”, assegnare la spesa a una vacanza esistente (select “Assegna a…”) ora sposta la competenza della spesa al primo giorno di quel periodo, invece di estendere le date della vacanza per coprirla (comportamento precedente)</w:t>
+      </w:r>
+    </w:p>
+    <w:p>
+      <w:pPr>
+        <w:pStyle w:val="ListParagraph"/>
+        <w:numPr>
+          <w:ilvl w:val="0"/>
+          <w:numId w:val="2"/>
+        </w:numPr>
+        <w:spacing w:after="36" w:before="36"/>
+      </w:pPr>
+      <w:r>
+        <w:rPr>
+          <w:rFonts w:ascii="Arial" w:cs="Arial" w:eastAsia="Arial" w:hAnsi="Arial"/>
+          <w:sz w:val="20"/>
+          <w:szCs w:val="20"/>
+        </w:rPr>
+        <w:t xml:space="preserve">Overlay “🚩 Spese non allocate”: selezione multipla (checkbox a sinistra) con azioni in blocco “Accetta selezionate” / “Ignora selezionate”, oltre alle azioni ✅/✕ su singola riga; ogni riga ha anche il tasto “MAI” per escludere in modo permanente tutte le spese con quella descrizione AI (pannello ⚙️ “Escluse sempre” per vedere/rimuovere l'elenco o aggiungere voci manualmente); la tabella esclude inoltre automaticamente le spese effettuate nella città di riferimento di casa (Impostazioni → Zona di Casa)</w:t>
       </w:r>
     </w:p>
     <w:p>

</xml_diff>

<commit_message>
Docs: aggiorna sez. 9.3 con il pannello vacanza/weekend collegato nel selettore categoria
</commit_message>
<xml_diff>
--- a/FamilyMoneyTracker_Instructions_v3.docx
+++ b/FamilyMoneyTracker_Instructions_v3.docx
@@ -13194,6 +13194,24 @@
           <w:szCs w:val="20"/>
         </w:rPr>
         <w:t xml:space="preserve">Overlay “🚩 Spese non allocate”: selezione multipla (checkbox a sinistra) con azioni in blocco “Accetta selezionate” / “Ignora selezionate”, oltre alle azioni ✅/✕ su singola riga; ogni riga ha anche il tasto “MAI” per escludere in modo permanente tutte le spese con quella descrizione AI (pannello ⚙️ “Escluse sempre” per vedere/rimuovere l'elenco o aggiungere voci manualmente); la tabella esclude inoltre automaticamente le spese effettuate nella città di riferimento di casa (Impostazioni → Zona di Casa)</w:t>
+      </w:r>
+    </w:p>
+    <w:p>
+      <w:pPr>
+        <w:pStyle w:val="ListParagraph"/>
+        <w:numPr>
+          <w:ilvl w:val="0"/>
+          <w:numId w:val="2"/>
+        </w:numPr>
+        <w:spacing w:after="36" w:before="36"/>
+      </w:pPr>
+      <w:r>
+        <w:rPr>
+          <w:rFonts w:ascii="Arial" w:cs="Arial" w:eastAsia="Arial" w:hAnsi="Arial"/>
+          <w:sz w:val="20"/>
+          <w:szCs w:val="20"/>
+        </w:rPr>
+        <w:t xml:space="preserve">Selettore categoria di una transazione (Transazioni): scegliendo L1 “Weekend e Vacanze” e L2 “Vacanze” o “Weekend” si apre un pannello a destra per collegare la spesa a una vacanza/weekend esistente o crearne una al volo, senza dover aprire Weekend e Vacanze; se la spesa cade già nel periodo scelto non cambia nulla, altrimenti la competenza viene spostata al primo giorno del periodo per collegarla</w:t>
       </w:r>
     </w:p>
     <w:p>

</xml_diff>

<commit_message>
Docs: aggiorna sez. 9.3 con tipo Vacanze/Weekend editabile a mano e allineamento L2 in Assegna a vacanza
</commit_message>
<xml_diff>
--- a/FamilyMoneyTracker_Instructions_v3.docx
+++ b/FamilyMoneyTracker_Instructions_v3.docx
@@ -13212,6 +13212,42 @@
           <w:szCs w:val="20"/>
         </w:rPr>
         <w:t xml:space="preserve">Selettore categoria di una transazione (Transazioni): scegliendo L1 “Weekend e Vacanze” e L2 “Vacanze” o “Weekend” si apre un pannello a destra per collegare la spesa a una vacanza/weekend esistente o crearne una al volo, senza dover aprire Weekend e Vacanze; se la spesa cade già nel periodo scelto non cambia nulla, altrimenti la competenza viene spostata al primo giorno del periodo per collegarla</w:t>
+      </w:r>
+    </w:p>
+    <w:p>
+      <w:pPr>
+        <w:pStyle w:val="ListParagraph"/>
+        <w:numPr>
+          <w:ilvl w:val="0"/>
+          <w:numId w:val="2"/>
+        </w:numPr>
+        <w:spacing w:after="36" w:before="36"/>
+      </w:pPr>
+      <w:r>
+        <w:rPr>
+          <w:rFonts w:ascii="Arial" w:cs="Arial" w:eastAsia="Arial" w:hAnsi="Arial"/>
+          <w:sz w:val="20"/>
+          <w:szCs w:val="20"/>
+        </w:rPr>
+        <w:t xml:space="preserve">Tipo (Vacanze/Weekend) di un periodo: nella tabella annuale il badge “Tipo” è ora modificabile a mano — click per alternare Vacanze/Weekend — invece di essere solo derivato dalle spese già assegnate o dalla durata; la scelta manuale ha sempre priorità e si riflette ovunque nell’app (grafici, conteggi, pannello vacanza collegato in Transazioni)</w:t>
+      </w:r>
+    </w:p>
+    <w:p>
+      <w:pPr>
+        <w:pStyle w:val="ListParagraph"/>
+        <w:numPr>
+          <w:ilvl w:val="0"/>
+          <w:numId w:val="2"/>
+        </w:numPr>
+        <w:spacing w:after="36" w:before="36"/>
+      </w:pPr>
+      <w:r>
+        <w:rPr>
+          <w:rFonts w:ascii="Arial" w:cs="Arial" w:eastAsia="Arial" w:hAnsi="Arial"/>
+          <w:sz w:val="20"/>
+          <w:szCs w:val="20"/>
+        </w:rPr>
+        <w:t xml:space="preserve">In “📆 Spese fuori periodo”, assegnare la spesa a una vacanza/weekend esistente ora allinea anche la L2 (Vacanze/Weekend) al tipo reale del periodo scelto, non solo la competenza — es. una spesa con L2 “Weekend” assegnata a una vacanza vera diventa automaticamente L2 “Vacanze”, e viceversa</w:t>
       </w:r>
     </w:p>
     <w:p>

</xml_diff>

<commit_message>
Docx: recupero 4 giri di modifiche non documentate
- 9.3 Vacanze e Weekend: aggiunti 5 bullet — typeOverride/vacationType()
  (tipo periodo editabile a mano), consolidamento tab 'Revisione' (le 3
  tabelle To review/Fuori periodo/Da confermare in un solo punto
  d'accesso), pannello 'Escluse sempre'/tasto MAI + esclusione città di
  casa, allineamento L2 quando si assegna a un periodo, sincronizzazione
  con il mega-step Vacanze del wizard import.
- Nuova sottosezione 'Spese (Overview) — UscitePage.jsx' (sezione 8):
  righe L1/L2 a zero nascoste automaticamente, toggle 'Adj vacanze'.
- Nuova sezione '5.8 Wizard di Import Unificato — ImportWizard.jsx':
  intero flusso (import→rifinisci→doppioni per sorgente, paypal+esito,
  compensazioni, mega-step vacanze, transazioni, riepilogo), navigazione
  a cornice fissa con stepper, back/undo.

Validato: babel n/a (docx), validate.py XSD OK (755→776 paragrafi),
render PDF verificato pagina per pagina.
</commit_message>
<xml_diff>
--- a/FamilyMoneyTracker_Instructions_v3.docx
+++ b/FamilyMoneyTracker_Instructions_v3.docx
@@ -5700,6 +5700,188 @@
           <w:szCs w:val="20"/>
         </w:rPr>
         <w:t xml:space="preserve">Risultato salvato in appPrefs.paypalImports tramite setAppPref</w:t>
+      </w:r>
+    </w:p>
+    <w:p>
+      <w:pPr>
+        <w:pStyle w:val="Heading2"/>
+        <w:spacing w:after="80" w:before="220"/>
+      </w:pPr>
+      <w:r>
+        <w:rPr>
+          <w:rFonts w:ascii="Arial" w:cs="Arial" w:eastAsia="Arial" w:hAnsi="Arial"/>
+          <w:b/>
+          <w:bCs/>
+          <w:color w:val="34495E"/>
+          <w:sz w:val="24"/>
+          <w:szCs w:val="24"/>
+        </w:rPr>
+        <w:t xml:space="preserve">5.8 Wizard di Import Unificato — ImportWizard.jsx</w:t>
+      </w:r>
+    </w:p>
+    <w:p>
+      <w:pPr>
+        <w:spacing w:after="60" w:before="60"/>
+      </w:pPr>
+      <w:r>
+        <w:rPr>
+          <w:rFonts w:ascii="Arial" w:cs="Arial" w:eastAsia="Arial" w:hAnsi="Arial"/>
+          <w:sz w:val="20"/>
+          <w:szCs w:val="20"/>
+        </w:rPr>
+        <w:t xml:space="preserve">Punto di ingresso alternativo all’import diretto (4.1-4.5) e a quello PayPal (5.1): concatena in un unico flusso guidato l’import di più sorgenti (conto corrente, carte di credito, PayPal), la rifinitura post-import, il controllo doppioni, le compensazioni e la revisione vacanze, chiudendo con un riepilogo — pensato per l’uso mensile ricorrente (“il 20 del mese apro e faccio tutto”).</w:t>
+      </w:r>
+    </w:p>
+    <w:p>
+      <w:pPr>
+        <w:pStyle w:val="ListParagraph"/>
+        <w:numPr>
+          <w:ilvl w:val="0"/>
+          <w:numId w:val="2"/>
+        </w:numPr>
+        <w:spacing w:after="36" w:before="36"/>
+      </w:pPr>
+      <w:r>
+        <w:rPr>
+          <w:rFonts w:ascii="Arial" w:cs="Arial" w:eastAsia="Arial" w:hAnsi="Arial"/>
+          <w:sz w:val="20"/>
+          <w:szCs w:val="20"/>
+        </w:rPr>
+        <w:t xml:space="preserve">Selezione sorgenti: checkbox Conto corrente / Carte di credito / PayPal, anche più di una insieme</w:t>
+      </w:r>
+    </w:p>
+    <w:p>
+      <w:pPr>
+        <w:pStyle w:val="ListParagraph"/>
+        <w:numPr>
+          <w:ilvl w:val="0"/>
+          <w:numId w:val="2"/>
+        </w:numPr>
+        <w:spacing w:after="36" w:before="36"/>
+      </w:pPr>
+      <w:r>
+        <w:rPr>
+          <w:rFonts w:ascii="Arial" w:cs="Arial" w:eastAsia="Arial" w:hAnsi="Arial"/>
+          <w:sz w:val="20"/>
+          <w:szCs w:val="20"/>
+        </w:rPr>
+        <w:t xml:space="preserve">Per ciascuna sorgente conto/carta, in sequenza: Import (riusa il modal CSV esistente, 4.1-4.5, incluse le 4 fasi interne parse → salvataggio con dedup automatico → categorizzazione AI → regole di sistema) → Rifinisci (3 schermate: transazioni senza categoria L2, senza AI Description, categorizzate solo dall’AI da verificare) → Doppioni (verifica se le righe appena lette dal CSV duplicano qualcosa già nel database della STESSA categoria — conto contro conto, carta contro carta, mai incrociate — con data e descrizione originale identiche, non simile: più severo del dedup automatico e silenzioso di 4.2, qui l’utente vede ogni possibile doppione e sceglie se eliminarlo o tenere entrambe le righe)</w:t>
+      </w:r>
+    </w:p>
+    <w:p>
+      <w:pPr>
+        <w:pStyle w:val="ListParagraph"/>
+        <w:numPr>
+          <w:ilvl w:val="0"/>
+          <w:numId w:val="2"/>
+        </w:numPr>
+        <w:spacing w:after="36" w:before="36"/>
+      </w:pPr>
+      <w:r>
+        <w:rPr>
+          <w:rFonts w:ascii="Arial" w:cs="Arial" w:eastAsia="Arial" w:hAnsi="Arial"/>
+          <w:sz w:val="20"/>
+          <w:szCs w:val="20"/>
+        </w:rPr>
+        <w:t xml:space="preserve">Se PayPal è selezionato: Import PayPal (5.1) seguito da una schermata di esito (importate, abbinate automaticamente, da approvare, non abbinate)</w:t>
+      </w:r>
+    </w:p>
+    <w:p>
+      <w:pPr>
+        <w:pStyle w:val="ListParagraph"/>
+        <w:numPr>
+          <w:ilvl w:val="0"/>
+          <w:numId w:val="2"/>
+        </w:numPr>
+        <w:spacing w:after="36" w:before="36"/>
+      </w:pPr>
+      <w:r>
+        <w:rPr>
+          <w:rFonts w:ascii="Arial" w:cs="Arial" w:eastAsia="Arial" w:hAnsi="Arial"/>
+          <w:sz w:val="20"/>
+          <w:szCs w:val="20"/>
+        </w:rPr>
+        <w:t xml:space="preserve">Compensazioni: abbinamenti Satispay / Altre Entrate / PayPal / Carte limitati alle sole transazioni di QUESTO import</w:t>
+      </w:r>
+    </w:p>
+    <w:p>
+      <w:pPr>
+        <w:pStyle w:val="ListParagraph"/>
+        <w:numPr>
+          <w:ilvl w:val="0"/>
+          <w:numId w:val="2"/>
+        </w:numPr>
+        <w:spacing w:after="36" w:before="36"/>
+      </w:pPr>
+      <w:r>
+        <w:rPr>
+          <w:rFonts w:ascii="Arial" w:cs="Arial" w:eastAsia="Arial" w:hAnsi="Arial"/>
+          <w:sz w:val="20"/>
+          <w:szCs w:val="20"/>
+        </w:rPr>
+        <w:t xml:space="preserve">Vacanze (mega-step, dopo Compensazioni): le 4 sezioni di revisione vacanze di 9.3 (prenotazioni da collegare, nuove vacanze/weekend candidate da confermare, spese “Weekend e Vacanze” fuori periodo, spese non ancora allocate) in un’unica pagina, filtrate SOLO alle transazioni effettivamente importate in questo flusso — non a un range di date — così restano sincronizzate con WeekendVacanzeV2Page</w:t>
+      </w:r>
+    </w:p>
+    <w:p>
+      <w:pPr>
+        <w:pStyle w:val="ListParagraph"/>
+        <w:numPr>
+          <w:ilvl w:val="0"/>
+          <w:numId w:val="2"/>
+        </w:numPr>
+        <w:spacing w:after="36" w:before="36"/>
+      </w:pPr>
+      <w:r>
+        <w:rPr>
+          <w:rFonts w:ascii="Arial" w:cs="Arial" w:eastAsia="Arial" w:hAnsi="Arial"/>
+          <w:sz w:val="20"/>
+          <w:szCs w:val="20"/>
+        </w:rPr>
+        <w:t xml:space="preserve">Transazioni: tabella finale di controllo con tutte le righe importate in questo flusso, prima del riepilogo</w:t>
+      </w:r>
+    </w:p>
+    <w:p>
+      <w:pPr>
+        <w:pStyle w:val="ListParagraph"/>
+        <w:numPr>
+          <w:ilvl w:val="0"/>
+          <w:numId w:val="2"/>
+        </w:numPr>
+        <w:spacing w:after="36" w:before="36"/>
+      </w:pPr>
+      <w:r>
+        <w:rPr>
+          <w:rFonts w:ascii="Arial" w:cs="Arial" w:eastAsia="Arial" w:hAnsi="Arial"/>
+          <w:sz w:val="20"/>
+          <w:szCs w:val="20"/>
+        </w:rPr>
+        <w:t xml:space="preserve">Riepilogo: KPI di chiusura (importate, regole applicate, doppioni, categorie/AI description mancanti, compensazioni in sospeso, ecc.)</w:t>
+      </w:r>
+    </w:p>
+    <w:p>
+      <w:pPr>
+        <w:pStyle w:val="ListParagraph"/>
+        <w:numPr>
+          <w:ilvl w:val="0"/>
+          <w:numId w:val="2"/>
+        </w:numPr>
+        <w:spacing w:after="36" w:before="36"/>
+      </w:pPr>
+      <w:r>
+        <w:rPr>
+          <w:rFonts w:ascii="Arial" w:cs="Arial" w:eastAsia="Arial" w:hAnsi="Arial"/>
+          <w:sz w:val="20"/>
+          <w:szCs w:val="20"/>
+        </w:rPr>
+        <w:t xml:space="preserve">Navigazione: cornice fissa (non cambia dimensione da uno step all’altro), stepper numerato sempre visibile in alto con lo stato fatto/corrente/da fare; “← Indietro” disponibile su ogni step nativo (mai dentro a uno step di import CSV, che richiederebbe rifare il caricamento) e barra “↩️ Annulla” condivisa per l’ultima azione fatta in un qualsiasi step</w:t>
+      </w:r>
+    </w:p>
+    <w:p>
+      <w:pPr>
+        <w:spacing w:after="60" w:before="60"/>
+      </w:pPr>
+      <w:r>
+        <w:t xml:space="preserve"/>
       </w:r>
     </w:p>
     <w:p>
@@ -11669,6 +11851,85 @@
     </w:p>
     <w:p>
       <w:pPr>
+        <w:pStyle w:val="Heading2"/>
+        <w:spacing w:after="80" w:before="220"/>
+      </w:pPr>
+      <w:r>
+        <w:rPr>
+          <w:rFonts w:ascii="Arial" w:cs="Arial" w:eastAsia="Arial" w:hAnsi="Arial"/>
+          <w:b/>
+          <w:bCs/>
+          <w:color w:val="34495E"/>
+          <w:sz w:val="24"/>
+          <w:szCs w:val="24"/>
+        </w:rPr>
+        <w:t xml:space="preserve">Spese (Overview) — UscitePage.jsx</w:t>
+      </w:r>
+    </w:p>
+    <w:p>
+      <w:pPr>
+        <w:pStyle w:val="ListParagraph"/>
+        <w:numPr>
+          <w:ilvl w:val="0"/>
+          <w:numId w:val="2"/>
+        </w:numPr>
+        <w:spacing w:after="36" w:before="36"/>
+      </w:pPr>
+      <w:r>
+        <w:rPr>
+          <w:rFonts w:ascii="Arial" w:cs="Arial" w:eastAsia="Arial" w:hAnsi="Arial"/>
+          <w:sz w:val="20"/>
+          <w:szCs w:val="20"/>
+        </w:rPr>
+        <w:t xml:space="preserve">Tabella categorie di spesa (L1, con drill-down per sottocategoria L2) × mesi, con confronto periodi e toggle “Adj vacanze”</w:t>
+      </w:r>
+    </w:p>
+    <w:p>
+      <w:pPr>
+        <w:pStyle w:val="ListParagraph"/>
+        <w:numPr>
+          <w:ilvl w:val="0"/>
+          <w:numId w:val="2"/>
+        </w:numPr>
+        <w:spacing w:after="36" w:before="36"/>
+      </w:pPr>
+      <w:r>
+        <w:rPr>
+          <w:rFonts w:ascii="Arial" w:cs="Arial" w:eastAsia="Arial" w:hAnsi="Arial"/>
+          <w:sz w:val="20"/>
+          <w:szCs w:val="20"/>
+        </w:rPr>
+        <w:t xml:space="preserve">Le righe (sia le categorie L1 sia le sottocategorie L2, quando la categoria è espansa) il cui totale è ESATTAMENTE zero in tutti i mesi mostrati vengono nascoste automaticamente — stesso criterio (rowTotal(cat1[, cat2]) !== 0) applicato coerentemente all’elenco principale e alla lista sottocategorie; se tutte le L2 di una categoria risultano a zero, sparisce anche l’icona di espansione (niente da mostrare)</w:t>
+      </w:r>
+    </w:p>
+    <w:p>
+      <w:pPr>
+        <w:pStyle w:val="ListParagraph"/>
+        <w:numPr>
+          <w:ilvl w:val="0"/>
+          <w:numId w:val="2"/>
+        </w:numPr>
+        <w:spacing w:after="36" w:before="36"/>
+      </w:pPr>
+      <w:r>
+        <w:rPr>
+          <w:rFonts w:ascii="Arial" w:cs="Arial" w:eastAsia="Arial" w:hAnsi="Arial"/>
+          <w:sz w:val="20"/>
+          <w:szCs w:val="20"/>
+        </w:rPr>
+        <w:t xml:space="preserve">Toggle “Adj vacanze”: riallocazione a somma zero delle spese di carburante/autostrada inserite manualmente su una vacanza (in WeekendVacanzeV2Page) dalla categoria “Veicoli” alla categoria “Weekend e Vacanze”, per coerenza contabile con i totali vacanza mostrati in quella pagina — non altera mai il Totale uscite complessivo, sposta solo l’attribuzione tra le due categorie</w:t>
+      </w:r>
+    </w:p>
+    <w:p>
+      <w:pPr>
+        <w:spacing w:after="60" w:before="60"/>
+      </w:pPr>
+      <w:r>
+        <w:t xml:space="preserve"/>
+      </w:r>
+    </w:p>
+    <w:p>
+      <w:pPr>
         <w:spacing w:after="60" w:before="60"/>
       </w:pPr>
       <w:r>
@@ -13193,7 +13454,7 @@
           <w:sz w:val="20"/>
           <w:szCs w:val="20"/>
         </w:rPr>
-        <w:t xml:space="preserve">Overlay “🚩 Spese non allocate”: selezione multipla (checkbox a sinistra) con azioni in blocco “Accetta selezionate” / “Ignora selezionate”, oltre alle azioni ✅/✕ su singola riga; ogni riga ha anche il tasto “MAI” per escludere in modo permanente tutte le spese con quella descrizione AI (pannello ⚙️ “Escluse sempre” per vedere/rimuovere l'elenco o aggiungere voci manualmente); la tabella esclude inoltre automaticamente le spese effettuate nella città di riferimento di casa (Impostazioni → Zona di Casa)</w:t>
+        <w:t xml:space="preserve">Tipo (Vacanze/Weekend) di un periodo: normalmente derivato (cat2 dominante delle transazioni già assegnate, fallback su durata 3+ notti = Vacanze) tramite l’unica funzione vacationType() (data/vacationRules.js); può essere impostato manualmente cliccando il badge “Tipo” nella tabella annuale di WeekendVacanzeV2Page — persistito come typeOverride sul periodo, ha sempre priorità sul calcolo automatico</w:t>
       </w:r>
     </w:p>
     <w:p>
@@ -13211,7 +13472,7 @@
           <w:sz w:val="20"/>
           <w:szCs w:val="20"/>
         </w:rPr>
-        <w:t xml:space="preserve">Selettore categoria di una transazione (Transazioni): scegliendo L1 “Weekend e Vacanze” e L2 “Vacanze” o “Weekend” si apre un pannello a destra per collegare la spesa a una vacanza/weekend esistente o crearne una al volo, senza dover aprire Weekend e Vacanze; se la spesa cade già nel periodo scelto non cambia nulla, altrimenti la competenza viene spostata al primo giorno del periodo per collegarla</w:t>
+        <w:t xml:space="preserve">Pulsante unico “🔎 Revisione” (con badge di conteggio totale) raccoglie 3 pannelli in un solo punto d’accesso: “Spese non allocate” (spese avvenute durante una vacanza dichiarata ma non ancora categorizzate come tali), “📆 Spese fuori periodo” (spese già “Weekend e Vacanze” la cui data non cade in nessun periodo dichiarato), “🔍 Vacanze e weekend da confermare” (cluster di spesa candidati non ancora dichiarati come periodo) — ognuno apre lo stesso modale di prima, solo l’accesso è consolidato</w:t>
       </w:r>
     </w:p>
     <w:p>
@@ -13229,7 +13490,7 @@
           <w:sz w:val="20"/>
           <w:szCs w:val="20"/>
         </w:rPr>
-        <w:t xml:space="preserve">Tipo (Vacanze/Weekend) di un periodo: nella tabella annuale il badge “Tipo” è ora modificabile a mano — click per alternare Vacanze/Weekend — invece di essere solo derivato dalle spese già assegnate o dalla durata; la scelta manuale ha sempre priorità e si riflette ovunque nell’app (grafici, conteggi, pannello vacanza collegato in Transazioni)</w:t>
+        <w:t xml:space="preserve">“Spese non allocate” esclude automaticamente le spese nella città di riferimento dell’utente (Impostazioni → Zona di Casa) e le descrizioni AI marcate “MAI” tramite il pannello ⚙️ Escluse sempre (appPrefs.wv2NeverAiDescs) — un click su “MAI” accanto a una riga la esclude per sempre, ovunque compaia con quella stessa descrizione AI; selezione multipla con checkbox + “Accetta selezionate”/“Ignora selezionate”, tutte le azioni (singole o multiple) sono annullabili con “Annulla” (8s)</w:t>
       </w:r>
     </w:p>
     <w:p>
@@ -13247,7 +13508,25 @@
           <w:sz w:val="20"/>
           <w:szCs w:val="20"/>
         </w:rPr>
-        <w:t xml:space="preserve">In “📆 Spese fuori periodo”, assegnare la spesa a una vacanza/weekend esistente ora allinea anche la L2 (Vacanze/Weekend) al tipo reale del periodo scelto, non solo la competenza — es. una spesa con L2 “Weekend” assegnata a una vacanza vera diventa automaticamente L2 “Vacanze”, e viceversa</w:t>
+        <w:t xml:space="preserve">Assegnare una spesa “fuori periodo” a un periodo esistente allinea anche la sua sottocategoria (Weekend/Vacanze) al tipo reale del periodo scelto (vacationType()), non solo la competenza</w:t>
+      </w:r>
+    </w:p>
+    <w:p>
+      <w:pPr>
+        <w:pStyle w:val="ListParagraph"/>
+        <w:numPr>
+          <w:ilvl w:val="0"/>
+          <w:numId w:val="2"/>
+        </w:numPr>
+        <w:spacing w:after="36" w:before="36"/>
+      </w:pPr>
+      <w:r>
+        <w:rPr>
+          <w:rFonts w:ascii="Arial" w:cs="Arial" w:eastAsia="Arial" w:hAnsi="Arial"/>
+          <w:sz w:val="20"/>
+          <w:szCs w:val="20"/>
+        </w:rPr>
+        <w:t xml:space="preserve">Le stesse identiche informazioni/appPrefs (calendarVacations, calendarNotVacationDates, wv2ReviewDismissed, wv2NeverAiDescs) sono riproposte — filtrate alle sole transazioni appena importate — nel mega-step “🏖️ Vacanze” del Wizard di Import unificato (vedi 5.8): le decisioni prese in un punto restano sincronizzate nell’altro</w:t>
       </w:r>
     </w:p>
     <w:p>

</xml_diff>

<commit_message>
Docx: recupero completo modifiche non documentate (eef4724..HEAD) - motore Mutuo/Forecast, Teoriche Spese, Sistema Compensazione, Nanny/Colf, Satispay, Veicoli
</commit_message>
<xml_diff>
--- a/FamilyMoneyTracker_Instructions_v3.docx
+++ b/FamilyMoneyTracker_Instructions_v3.docx
@@ -5700,188 +5700,6 @@
           <w:szCs w:val="20"/>
         </w:rPr>
         <w:t xml:space="preserve">Risultato salvato in appPrefs.paypalImports tramite setAppPref</w:t>
-      </w:r>
-    </w:p>
-    <w:p>
-      <w:pPr>
-        <w:pStyle w:val="Heading2"/>
-        <w:spacing w:after="80" w:before="220"/>
-      </w:pPr>
-      <w:r>
-        <w:rPr>
-          <w:rFonts w:ascii="Arial" w:cs="Arial" w:eastAsia="Arial" w:hAnsi="Arial"/>
-          <w:b/>
-          <w:bCs/>
-          <w:color w:val="34495E"/>
-          <w:sz w:val="24"/>
-          <w:szCs w:val="24"/>
-        </w:rPr>
-        <w:t xml:space="preserve">5.8 Wizard di Import Unificato — ImportWizard.jsx</w:t>
-      </w:r>
-    </w:p>
-    <w:p>
-      <w:pPr>
-        <w:spacing w:after="60" w:before="60"/>
-      </w:pPr>
-      <w:r>
-        <w:rPr>
-          <w:rFonts w:ascii="Arial" w:cs="Arial" w:eastAsia="Arial" w:hAnsi="Arial"/>
-          <w:sz w:val="20"/>
-          <w:szCs w:val="20"/>
-        </w:rPr>
-        <w:t xml:space="preserve">Punto di ingresso alternativo all’import diretto (4.1-4.5) e a quello PayPal (5.1): concatena in un unico flusso guidato l’import di più sorgenti (conto corrente, carte di credito, PayPal), la rifinitura post-import, il controllo doppioni, le compensazioni e la revisione vacanze, chiudendo con un riepilogo — pensato per l’uso mensile ricorrente (“il 20 del mese apro e faccio tutto”).</w:t>
-      </w:r>
-    </w:p>
-    <w:p>
-      <w:pPr>
-        <w:pStyle w:val="ListParagraph"/>
-        <w:numPr>
-          <w:ilvl w:val="0"/>
-          <w:numId w:val="2"/>
-        </w:numPr>
-        <w:spacing w:after="36" w:before="36"/>
-      </w:pPr>
-      <w:r>
-        <w:rPr>
-          <w:rFonts w:ascii="Arial" w:cs="Arial" w:eastAsia="Arial" w:hAnsi="Arial"/>
-          <w:sz w:val="20"/>
-          <w:szCs w:val="20"/>
-        </w:rPr>
-        <w:t xml:space="preserve">Selezione sorgenti: checkbox Conto corrente / Carte di credito / PayPal, anche più di una insieme</w:t>
-      </w:r>
-    </w:p>
-    <w:p>
-      <w:pPr>
-        <w:pStyle w:val="ListParagraph"/>
-        <w:numPr>
-          <w:ilvl w:val="0"/>
-          <w:numId w:val="2"/>
-        </w:numPr>
-        <w:spacing w:after="36" w:before="36"/>
-      </w:pPr>
-      <w:r>
-        <w:rPr>
-          <w:rFonts w:ascii="Arial" w:cs="Arial" w:eastAsia="Arial" w:hAnsi="Arial"/>
-          <w:sz w:val="20"/>
-          <w:szCs w:val="20"/>
-        </w:rPr>
-        <w:t xml:space="preserve">Per ciascuna sorgente conto/carta, in sequenza: Import (riusa il modal CSV esistente, 4.1-4.5, incluse le 4 fasi interne parse → salvataggio con dedup automatico → categorizzazione AI → regole di sistema) → Rifinisci (3 schermate: transazioni senza categoria L2, senza AI Description, categorizzate solo dall’AI da verificare) → Doppioni (verifica se le righe appena lette dal CSV duplicano qualcosa già nel database della STESSA categoria — conto contro conto, carta contro carta, mai incrociate — con data e descrizione originale identiche, non simile: più severo del dedup automatico e silenzioso di 4.2, qui l’utente vede ogni possibile doppione e sceglie se eliminarlo o tenere entrambe le righe)</w:t>
-      </w:r>
-    </w:p>
-    <w:p>
-      <w:pPr>
-        <w:pStyle w:val="ListParagraph"/>
-        <w:numPr>
-          <w:ilvl w:val="0"/>
-          <w:numId w:val="2"/>
-        </w:numPr>
-        <w:spacing w:after="36" w:before="36"/>
-      </w:pPr>
-      <w:r>
-        <w:rPr>
-          <w:rFonts w:ascii="Arial" w:cs="Arial" w:eastAsia="Arial" w:hAnsi="Arial"/>
-          <w:sz w:val="20"/>
-          <w:szCs w:val="20"/>
-        </w:rPr>
-        <w:t xml:space="preserve">Se PayPal è selezionato: Import PayPal (5.1) seguito da una schermata di esito (importate, abbinate automaticamente, da approvare, non abbinate)</w:t>
-      </w:r>
-    </w:p>
-    <w:p>
-      <w:pPr>
-        <w:pStyle w:val="ListParagraph"/>
-        <w:numPr>
-          <w:ilvl w:val="0"/>
-          <w:numId w:val="2"/>
-        </w:numPr>
-        <w:spacing w:after="36" w:before="36"/>
-      </w:pPr>
-      <w:r>
-        <w:rPr>
-          <w:rFonts w:ascii="Arial" w:cs="Arial" w:eastAsia="Arial" w:hAnsi="Arial"/>
-          <w:sz w:val="20"/>
-          <w:szCs w:val="20"/>
-        </w:rPr>
-        <w:t xml:space="preserve">Compensazioni: abbinamenti Satispay / Altre Entrate / PayPal / Carte limitati alle sole transazioni di QUESTO import</w:t>
-      </w:r>
-    </w:p>
-    <w:p>
-      <w:pPr>
-        <w:pStyle w:val="ListParagraph"/>
-        <w:numPr>
-          <w:ilvl w:val="0"/>
-          <w:numId w:val="2"/>
-        </w:numPr>
-        <w:spacing w:after="36" w:before="36"/>
-      </w:pPr>
-      <w:r>
-        <w:rPr>
-          <w:rFonts w:ascii="Arial" w:cs="Arial" w:eastAsia="Arial" w:hAnsi="Arial"/>
-          <w:sz w:val="20"/>
-          <w:szCs w:val="20"/>
-        </w:rPr>
-        <w:t xml:space="preserve">Vacanze (mega-step, dopo Compensazioni): le 4 sezioni di revisione vacanze di 9.3 (prenotazioni da collegare, nuove vacanze/weekend candidate da confermare, spese “Weekend e Vacanze” fuori periodo, spese non ancora allocate) in un’unica pagina, filtrate SOLO alle transazioni effettivamente importate in questo flusso — non a un range di date — così restano sincronizzate con WeekendVacanzeV2Page</w:t>
-      </w:r>
-    </w:p>
-    <w:p>
-      <w:pPr>
-        <w:pStyle w:val="ListParagraph"/>
-        <w:numPr>
-          <w:ilvl w:val="0"/>
-          <w:numId w:val="2"/>
-        </w:numPr>
-        <w:spacing w:after="36" w:before="36"/>
-      </w:pPr>
-      <w:r>
-        <w:rPr>
-          <w:rFonts w:ascii="Arial" w:cs="Arial" w:eastAsia="Arial" w:hAnsi="Arial"/>
-          <w:sz w:val="20"/>
-          <w:szCs w:val="20"/>
-        </w:rPr>
-        <w:t xml:space="preserve">Transazioni: tabella finale di controllo con tutte le righe importate in questo flusso, prima del riepilogo</w:t>
-      </w:r>
-    </w:p>
-    <w:p>
-      <w:pPr>
-        <w:pStyle w:val="ListParagraph"/>
-        <w:numPr>
-          <w:ilvl w:val="0"/>
-          <w:numId w:val="2"/>
-        </w:numPr>
-        <w:spacing w:after="36" w:before="36"/>
-      </w:pPr>
-      <w:r>
-        <w:rPr>
-          <w:rFonts w:ascii="Arial" w:cs="Arial" w:eastAsia="Arial" w:hAnsi="Arial"/>
-          <w:sz w:val="20"/>
-          <w:szCs w:val="20"/>
-        </w:rPr>
-        <w:t xml:space="preserve">Riepilogo: KPI di chiusura (importate, regole applicate, doppioni, categorie/AI description mancanti, compensazioni in sospeso, ecc.)</w:t>
-      </w:r>
-    </w:p>
-    <w:p>
-      <w:pPr>
-        <w:pStyle w:val="ListParagraph"/>
-        <w:numPr>
-          <w:ilvl w:val="0"/>
-          <w:numId w:val="2"/>
-        </w:numPr>
-        <w:spacing w:after="36" w:before="36"/>
-      </w:pPr>
-      <w:r>
-        <w:rPr>
-          <w:rFonts w:ascii="Arial" w:cs="Arial" w:eastAsia="Arial" w:hAnsi="Arial"/>
-          <w:sz w:val="20"/>
-          <w:szCs w:val="20"/>
-        </w:rPr>
-        <w:t xml:space="preserve">Navigazione: cornice fissa (non cambia dimensione da uno step all’altro), stepper numerato sempre visibile in alto con lo stato fatto/corrente/da fare; “← Indietro” disponibile su ogni step nativo (mai dentro a uno step di import CSV, che richiederebbe rifare il caricamento) e barra “↩️ Annulla” condivisa per l’ultima azione fatta in un qualsiasi step</w:t>
-      </w:r>
-    </w:p>
-    <w:p>
-      <w:pPr>
-        <w:spacing w:after="60" w:before="60"/>
-      </w:pPr>
-      <w:r>
-        <w:t xml:space="preserve"/>
       </w:r>
     </w:p>
     <w:p>
@@ -11851,6 +11669,14 @@
     </w:p>
     <w:p>
       <w:pPr>
+        <w:spacing w:after="60" w:before="60"/>
+      </w:pPr>
+      <w:r>
+        <w:t xml:space="preserve"/>
+      </w:r>
+    </w:p>
+    <w:p>
+      <w:pPr>
         <w:pStyle w:val="Heading2"/>
         <w:spacing w:after="80" w:before="220"/>
       </w:pPr>
@@ -11863,7 +11689,7 @@
           <w:sz w:val="24"/>
           <w:szCs w:val="24"/>
         </w:rPr>
-        <w:t xml:space="preserve">Spese (Overview) — UscitePage.jsx</w:t>
+        <w:t xml:space="preserve">Nanny e Colf</w:t>
       </w:r>
     </w:p>
     <w:p>
@@ -11881,7 +11707,7 @@
           <w:sz w:val="20"/>
           <w:szCs w:val="20"/>
         </w:rPr>
-        <w:t xml:space="preserve">Tabella categorie di spesa (L1, con drill-down per sottocategoria L2) × mesi, con confronto periodi e toggle “Adj vacanze”</w:t>
+        <w:t xml:space="preserve">Tabella "Conto Orario Mensile": mese, ore lavorate, tariffa oraria, totale atteso, metodo pagamento, stato riconciliazione — con Totale (riga, anno, media mensile) mostrato con decimali</w:t>
       </w:r>
     </w:p>
     <w:p>
@@ -11896,10 +11722,20 @@
       <w:r>
         <w:rPr>
           <w:rFonts w:ascii="Arial" w:cs="Arial" w:eastAsia="Arial" w:hAnsi="Arial"/>
-          <w:sz w:val="20"/>
-          <w:szCs w:val="20"/>
-        </w:rPr>
-        <w:t xml:space="preserve">Le righe (sia le categorie L1 sia le sottocategorie L2, quando la categoria è espansa) il cui totale è ESATTAMENTE zero in tutti i mesi mostrati vengono nascoste automaticamente — stesso criterio (rowTotal(cat1[, cat2]) !== 0) applicato coerentemente all’elenco principale e alla lista sottocategorie; se tutte le L2 di una categoria risultano a zero, sparisce anche l’icona di espansione (niente da mostrare)</w:t>
+          <w:b/>
+          <w:bCs/>
+          <w:sz w:val="20"/>
+          <w:szCs w:val="20"/>
+        </w:rPr>
+        <w:t xml:space="preserve">Bottone "Registra" (ex "Registra spesa"): </w:t>
+      </w:r>
+      <w:r>
+        <w:rPr>
+          <w:rFonts w:ascii="Arial" w:cs="Arial" w:eastAsia="Arial" w:hAnsi="Arial"/>
+          <w:sz w:val="20"/>
+          <w:szCs w:val="20"/>
+        </w:rPr>
+        <w:t xml:space="preserve">unico punto in cui viene creata la spesa reale in Transazioni; crea la transazione + gli split/l’esclusione sui prelievi collegati, ma SOLO se il mese è coperto al 100% dai prelievi selezionati (altrimenti blocca con messaggio, niente creazione parziale)</w:t>
       </w:r>
     </w:p>
     <w:p>
@@ -11917,40 +11753,7 @@
           <w:sz w:val="20"/>
           <w:szCs w:val="20"/>
         </w:rPr>
-        <w:t xml:space="preserve">Toggle “Adj vacanze”: riallocazione a somma zero delle spese di carburante/autostrada inserite manualmente su una vacanza (in WeekendVacanzeV2Page) dalla categoria “Veicoli” alla categoria “Weekend e Vacanze”, per coerenza contabile con i totali vacanza mostrati in quella pagina — non altera mai il Totale uscite complessivo, sposta solo l’attribuzione tra le due categorie</w:t>
-      </w:r>
-    </w:p>
-    <w:p>
-      <w:pPr>
-        <w:spacing w:after="60" w:before="60"/>
-      </w:pPr>
-      <w:r>
-        <w:t xml:space="preserve"/>
-      </w:r>
-    </w:p>
-    <w:p>
-      <w:pPr>
-        <w:spacing w:after="60" w:before="60"/>
-      </w:pPr>
-      <w:r>
-        <w:t xml:space="preserve"/>
-      </w:r>
-    </w:p>
-    <w:p>
-      <w:pPr>
-        <w:pStyle w:val="Heading2"/>
-        <w:spacing w:after="80" w:before="220"/>
-      </w:pPr>
-      <w:r>
-        <w:rPr>
-          <w:rFonts w:ascii="Arial" w:cs="Arial" w:eastAsia="Arial" w:hAnsi="Arial"/>
-          <w:b/>
-          <w:bCs/>
-          <w:color w:val="34495E"/>
-          <w:sz w:val="24"/>
-          <w:szCs w:val="24"/>
-        </w:rPr>
-        <w:t xml:space="preserve">Nanny e Colf</w:t>
+        <w:t xml:space="preserve">Conferma "Registra": mostra la data della nuova transazione prima di creare, e aggiunge automaticamente una nota sia sulla spesa che sulla/e transazione/i di prelievo residuo, con i codici transazione coinvolti</w:t>
       </w:r>
     </w:p>
     <w:p>
@@ -11968,7 +11771,7 @@
           <w:sz w:val="20"/>
           <w:szCs w:val="20"/>
         </w:rPr>
-        <w:t xml:space="preserve">Tabella "Conto Orario Mensile": mese, ore lavorate, tariffa oraria, totale atteso, metodo pagamento, stato riconciliazione</w:t>
+        <w:t xml:space="preserve">Riconciliazione multi-prelievo: il collegamento mese↔prelievi usa {allocations:[{txId, amt}], ...} anziché un singolo prelievo — retrocompatibile con il vecchio formato {txId, nannyAmt}; ogni somma di residuo/usato va sempre tramite le funzioni dedicate dello store (computeAtmUsed/computeAtmUsedExcluding), mai ricalcolata a mano nelle pagine</w:t>
       </w:r>
     </w:p>
     <w:p>
@@ -11986,7 +11789,7 @@
           <w:sz w:val="20"/>
           <w:szCs w:val="20"/>
         </w:rPr>
-        <w:t xml:space="preserve">Colonna Riconciliato: ✅ + badge 💵 (contanti) / 🏦 (bonifico) se abbinata — oppure 💡 Auto-collega se trovato match automatico — oppure 🔗 Collega per abbinamento manuale</w:t>
+        <w:t xml:space="preserve">Box "Storico Prelievi": mostra Importo E Residuo per ogni mese; click su un mese con più prelievi espande il breakdown; popup Data Prelievo mostra anche l’importo originale oltre a quello usato, e l’ultimo €/ora usato</w:t>
       </w:r>
     </w:p>
     <w:p>
@@ -12004,7 +11807,7 @@
           <w:sz w:val="20"/>
           <w:szCs w:val="20"/>
         </w:rPr>
-        <w:t xml:space="preserve">Modal abbinamento: mostra importo atteso, lista suggerimenti auto (transazioni con importo entro ±5%), campo inserimento manuale txId, selezione metodo Contanti/Conto</w:t>
+        <w:t xml:space="preserve">Colonna "Residuo Prelievi Mese" (ex "Prelievi nel mese"); modale "Aggiungi Mese" precompila €/ora con l’ultimo valore usato e non ha più errori di arrotondamento sul Totale</w:t>
       </w:r>
     </w:p>
     <w:p>
@@ -12022,7 +11825,7 @@
           <w:sz w:val="20"/>
           <w:szCs w:val="20"/>
         </w:rPr>
-        <w:t xml:space="preserve">Default metodo: determinato da appPrefs.cashCats — se Colf o Nanny sono in cashCats → default = Contanti</w:t>
+        <w:t xml:space="preserve">Bottone di modifica per riga: riapre "Aggiungi Mese" precompilato con i valori esistenti</w:t>
       </w:r>
     </w:p>
     <w:p>
@@ -12040,32 +11843,7 @@
           <w:sz w:val="20"/>
           <w:szCs w:val="20"/>
         </w:rPr>
-        <w:t xml:space="preserve">Auto-match: cerca prelievi ATM o bonifici con importo entro ±5% e data nello stesso mese</w:t>
-      </w:r>
-    </w:p>
-    <w:p>
-      <w:pPr>
-        <w:spacing w:after="60" w:before="60"/>
-      </w:pPr>
-      <w:r>
-        <w:t xml:space="preserve"/>
-      </w:r>
-    </w:p>
-    <w:p>
-      <w:pPr>
-        <w:pStyle w:val="Heading2"/>
-        <w:spacing w:after="80" w:before="220"/>
-      </w:pPr>
-      <w:r>
-        <w:rPr>
-          <w:rFonts w:ascii="Arial" w:cs="Arial" w:eastAsia="Arial" w:hAnsi="Arial"/>
-          <w:b/>
-          <w:bCs/>
-          <w:color w:val="34495E"/>
-          <w:sz w:val="24"/>
-          <w:szCs w:val="24"/>
-        </w:rPr>
-        <w:t xml:space="preserve">Veicoli — VeicoliRegistroPage.jsx</w:t>
+        <w:t xml:space="preserve">Nota tramite pallino (●) in tabella quando la riga ha un commento associato</w:t>
       </w:r>
     </w:p>
     <w:p>
@@ -12080,10 +11858,37 @@
       <w:r>
         <w:rPr>
           <w:rFonts w:ascii="Arial" w:cs="Arial" w:eastAsia="Arial" w:hAnsi="Arial"/>
-          <w:sz w:val="20"/>
-          <w:szCs w:val="20"/>
-        </w:rPr>
-        <w:t xml:space="preserve">Lista veicoli con: nome, targa, anno, assicurazione scadenza, revisione scadenza, bollo scadenza — colori semaforo (verde/giallo/rosso) in base ai giorni rimanenti</w:t>
+          <w:b/>
+          <w:bCs/>
+          <w:sz w:val="20"/>
+          <w:szCs w:val="20"/>
+        </w:rPr>
+        <w:t xml:space="preserve">Fix reale (2026-07-23): </w:t>
+      </w:r>
+      <w:r>
+        <w:rPr>
+          <w:rFonts w:ascii="Arial" w:cs="Arial" w:eastAsia="Arial" w:hAnsi="Arial"/>
+          <w:sz w:val="20"/>
+          <w:szCs w:val="20"/>
+        </w:rPr>
+        <w:t xml:space="preserve">syncCashTransactions NON crea più automaticamente transazioni cash-nanny-/cash-colf-, nemmeno per righe già riconciliate ma non ancora "Registrate" — prima causava variazioni di saldo a sorpresa al solo "Conferma riconciliazione". Ora la spesa nasce esclusivamente dal bottone "Registra"; eventuali vecchie transazioni cash-nanny-/cash-colf- non più valide vengono rimosse automaticamente dal diffing di sync al giro successivo (Veicoli invariato, continua a usare cash-veh-)</w:t>
+      </w:r>
+    </w:p>
+    <w:p>
+      <w:pPr>
+        <w:pStyle w:val="Heading2"/>
+        <w:spacing w:after="80" w:before="220"/>
+      </w:pPr>
+      <w:r>
+        <w:rPr>
+          <w:rFonts w:ascii="Arial" w:cs="Arial" w:eastAsia="Arial" w:hAnsi="Arial"/>
+          <w:b/>
+          <w:bCs/>
+          <w:color w:val="34495E"/>
+          <w:sz w:val="24"/>
+          <w:szCs w:val="24"/>
+        </w:rPr>
+        <w:t xml:space="preserve">Veicoli — VeicoliRegistroPage.jsx</w:t>
       </w:r>
     </w:p>
     <w:p>
@@ -12101,7 +11906,7 @@
           <w:sz w:val="20"/>
           <w:szCs w:val="20"/>
         </w:rPr>
-        <w:t xml:space="preserve">Tab Spese: tutte le spese per veicolo (carburante, manutenzione, parcheggio, ecc.)</w:t>
+        <w:t xml:space="preserve">Lista veicoli con: nome, targa, anno, assicurazione scadenza, revisione scadenza, bollo scadenza — colori semaforo (verde/giallo/rosso) in base ai giorni rimanenti</w:t>
       </w:r>
     </w:p>
     <w:p>
@@ -12119,7 +11924,7 @@
           <w:sz w:val="20"/>
           <w:szCs w:val="20"/>
         </w:rPr>
-        <w:t xml:space="preserve">Riconciliazione: Modal "Collega" con badge 💵/🏦, importo parziale editabile, selezione metodo</w:t>
+        <w:t xml:space="preserve">Tab Spese: tutte le spese per veicolo (carburante, manutenzione, parcheggio, ecc.)</w:t>
       </w:r>
     </w:p>
     <w:p>
@@ -12137,7 +11942,7 @@
           <w:sz w:val="20"/>
           <w:szCs w:val="20"/>
         </w:rPr>
-        <w:t xml:space="preserve">Importo parziale: se l'importo abbinato è diverso dal totale → marcato "(parziale)"</w:t>
+        <w:t xml:space="preserve">Riconciliazione: Modal "Collega" con badge 💵/🏦, importo parziale editabile, selezione metodo</w:t>
       </w:r>
     </w:p>
     <w:p>
@@ -12155,7 +11960,7 @@
           <w:sz w:val="20"/>
           <w:szCs w:val="20"/>
         </w:rPr>
-        <w:t xml:space="preserve">Bidirezionale: da Veicoli si abbina un prelievo contanti; da Contanti si assegna una spesa veicolo</w:t>
+        <w:t xml:space="preserve">Importo parziale: se l'importo abbinato è diverso dal totale → marcato "(parziale)"</w:t>
       </w:r>
     </w:p>
     <w:p>
@@ -12173,32 +11978,7 @@
           <w:sz w:val="20"/>
           <w:szCs w:val="20"/>
         </w:rPr>
-        <w:t xml:space="preserve">AllExpensesTable usa getMergedCats() per i selettori cat1/cat2</w:t>
-      </w:r>
-    </w:p>
-    <w:p>
-      <w:pPr>
-        <w:spacing w:after="60" w:before="60"/>
-      </w:pPr>
-      <w:r>
-        <w:t xml:space="preserve"/>
-      </w:r>
-    </w:p>
-    <w:p>
-      <w:pPr>
-        <w:pStyle w:val="Heading2"/>
-        <w:spacing w:after="80" w:before="220"/>
-      </w:pPr>
-      <w:r>
-        <w:rPr>
-          <w:rFonts w:ascii="Arial" w:cs="Arial" w:eastAsia="Arial" w:hAnsi="Arial"/>
-          <w:b/>
-          <w:bCs/>
-          <w:color w:val="34495E"/>
-          <w:sz w:val="24"/>
-          <w:szCs w:val="24"/>
-        </w:rPr>
-        <w:t xml:space="preserve">Satispay — SatispayPage.jsx</w:t>
+        <w:t xml:space="preserve">Bidirezionale: da Veicoli si abbina un prelievo contanti; da Contanti si assegna una spesa veicolo</w:t>
       </w:r>
     </w:p>
     <w:p>
@@ -12216,7 +11996,7 @@
           <w:sz w:val="20"/>
           <w:szCs w:val="20"/>
         </w:rPr>
-        <w:t xml:space="preserve">N fondi aggiungibili: nome, icona emoji, colore, versamento mensile, data inizio per-fondo (non globale)</w:t>
+        <w:t xml:space="preserve">AllExpensesTable usa getMergedCats() per i selettori cat1/cat2</w:t>
       </w:r>
     </w:p>
     <w:p>
@@ -12231,10 +12011,20 @@
       <w:r>
         <w:rPr>
           <w:rFonts w:ascii="Arial" w:cs="Arial" w:eastAsia="Arial" w:hAnsi="Arial"/>
-          <w:sz w:val="20"/>
-          <w:szCs w:val="20"/>
-        </w:rPr>
-        <w:t xml:space="preserve">Struttura categorie per fondo: coppie L1+L2 ordinate (non stringa unica)</w:t>
+          <w:b/>
+          <w:bCs/>
+          <w:sz w:val="20"/>
+          <w:szCs w:val="20"/>
+        </w:rPr>
+        <w:t xml:space="preserve">Stima AI "Valore di mercato" (bottone ✨ nel modale veicolo): </w:t>
+      </w:r>
+      <w:r>
+        <w:rPr>
+          <w:rFonts w:ascii="Arial" w:cs="Arial" w:eastAsia="Arial" w:hAnsi="Arial"/>
+          <w:sz w:val="20"/>
+          <w:szCs w:val="20"/>
+        </w:rPr>
+        <w:t xml:space="preserve">estimateVehicleMarketValue() in aiService.js interroga gpt-4o-mini-search-preview (ricerca web reale, stile Autoscout) e media eventuali range restituiti; refresh automatico proposto dopo 1 mese dall’ultima stima; Patrimonio mostra la % di variazione rispetto al valore precedente</w:t>
       </w:r>
     </w:p>
     <w:p>
@@ -12252,7 +12042,7 @@
           <w:sz w:val="20"/>
           <w:szCs w:val="20"/>
         </w:rPr>
-        <w:t xml:space="preserve">Griglia mesi: righe = categorie (L1+L2), colonne = mesi dal mese di inizio. Colori colonne: blu=passato, verde=corrente, arancione=futuro</w:t>
+        <w:t xml:space="preserve">Registro chilometraggio: data + km rilevati si aggiungono direttamente dalle impostazioni del veicolo (non più da un bottone card separato)</w:t>
       </w:r>
     </w:p>
     <w:p>
@@ -12270,7 +12060,7 @@
           <w:sz w:val="20"/>
           <w:szCs w:val="20"/>
         </w:rPr>
-        <w:t xml:space="preserve">Celle editabili inline con click. Riga Totale calcolata automaticamente.</w:t>
+        <w:t xml:space="preserve">Grafici Registro Veicoli: media annua, andamento parcheggio, istogramma km/costi per anno</w:t>
       </w:r>
     </w:p>
     <w:p>
@@ -12288,7 +12078,32 @@
           <w:sz w:val="20"/>
           <w:szCs w:val="20"/>
         </w:rPr>
-        <w:t xml:space="preserve">Riga Riconciliazione: ✅ se abbinata, ⚠ se non abbinata con pulsante "Abbina"</w:t>
+        <w:t xml:space="preserve">Scadenze veicolo: solo il Bollo si rinnova automaticamente (le altre — assicurazione, revisione — richiedono conferma con importo); bottone "Rinnovato" mostrato solo se la scadenza è passata; costo sempre visibile in colonna, auto-derivato dall’ultima spesa reale collegata quando disponibile</w:t>
+      </w:r>
+    </w:p>
+    <w:p>
+      <w:pPr>
+        <w:spacing w:after="60" w:before="60"/>
+      </w:pPr>
+      <w:r>
+        <w:t xml:space="preserve"/>
+      </w:r>
+    </w:p>
+    <w:p>
+      <w:pPr>
+        <w:pStyle w:val="Heading2"/>
+        <w:spacing w:after="80" w:before="220"/>
+      </w:pPr>
+      <w:r>
+        <w:rPr>
+          <w:rFonts w:ascii="Arial" w:cs="Arial" w:eastAsia="Arial" w:hAnsi="Arial"/>
+          <w:b/>
+          <w:bCs/>
+          <w:color w:val="34495E"/>
+          <w:sz w:val="24"/>
+          <w:szCs w:val="24"/>
+        </w:rPr>
+        <w:t xml:space="preserve">Satispay — SatispayPage.jsx</w:t>
       </w:r>
     </w:p>
     <w:p>
@@ -12306,7 +12121,7 @@
           <w:sz w:val="20"/>
           <w:szCs w:val="20"/>
         </w:rPr>
-        <w:t xml:space="preserve">Abbinamento: supporta importo parziale e scelta 💵 contanti / 🏦 bonifico</w:t>
+        <w:t xml:space="preserve">N fondi aggiungibili: nome, icona emoji, colore, versamento mensile, data inizio per-fondo (non globale)</w:t>
       </w:r>
     </w:p>
     <w:p>
@@ -12324,32 +12139,7 @@
           <w:sz w:val="20"/>
           <w:szCs w:val="20"/>
         </w:rPr>
-        <w:t xml:space="preserve">Flag _flagged su righe da rivedere → sfondo arancione</w:t>
-      </w:r>
-    </w:p>
-    <w:p>
-      <w:pPr>
-        <w:spacing w:after="60" w:before="60"/>
-      </w:pPr>
-      <w:r>
-        <w:t xml:space="preserve"/>
-      </w:r>
-    </w:p>
-    <w:p>
-      <w:pPr>
-        <w:pStyle w:val="Heading2"/>
-        <w:spacing w:after="80" w:before="220"/>
-      </w:pPr>
-      <w:r>
-        <w:rPr>
-          <w:rFonts w:ascii="Arial" w:cs="Arial" w:eastAsia="Arial" w:hAnsi="Arial"/>
-          <w:b/>
-          <w:bCs/>
-          <w:color w:val="34495E"/>
-          <w:sz w:val="24"/>
-          <w:szCs w:val="24"/>
-        </w:rPr>
-        <w:t xml:space="preserve">Forecast — ForecastPage.jsx</w:t>
+        <w:t xml:space="preserve">Struttura categorie per fondo: coppie L1+L2 ordinate (non stringa unica)</w:t>
       </w:r>
     </w:p>
     <w:p>
@@ -12367,7 +12157,7 @@
           <w:sz w:val="20"/>
           <w:szCs w:val="20"/>
         </w:rPr>
-        <w:t xml:space="preserve">Selettore orizzonte: 1 Anno (colonne mensili), 3 Anni (trimestrali), 5/10/20 Anni (annuali)</w:t>
+        <w:t xml:space="preserve">Griglia mesi: righe = categorie (L1+L2), colonne = mesi dal mese di inizio. Colori colonne: blu=passato, verde=corrente, arancione=futuro</w:t>
       </w:r>
     </w:p>
     <w:p>
@@ -12385,7 +12175,7 @@
           <w:sz w:val="20"/>
           <w:szCs w:val="20"/>
         </w:rPr>
-        <w:t xml:space="preserve">Grafico: patrimonio crescente + mutuo decrescente (raggiunge zero alla scadenza)</w:t>
+        <w:t xml:space="preserve">Celle editabili inline con click. Riga Totale calcolata automaticamente.</w:t>
       </w:r>
     </w:p>
     <w:p>
@@ -12403,7 +12193,7 @@
           <w:sz w:val="20"/>
           <w:szCs w:val="20"/>
         </w:rPr>
-        <w:t xml:space="preserve">Vista 1 Anno: barre colorate — blu = mesi storici con dati reali, arancione = proiezione futura</w:t>
+        <w:t xml:space="preserve">Riga Riconciliazione: ✅ se abbinata, ⚠ se non abbinata con pulsante "Abbina"</w:t>
       </w:r>
     </w:p>
     <w:p>
@@ -12421,7 +12211,7 @@
           <w:sz w:val="20"/>
           <w:szCs w:val="20"/>
         </w:rPr>
-        <w:t xml:space="preserve">Tabella P&amp;L righe: Stipendio Marco, Stipendio Sofia, ▸ Totale Entrate, una riga per categoria spesa, ▸ Totale Spese, ◎ Risparmio Lordo</w:t>
+        <w:t xml:space="preserve">Abbinamento: supporta importo parziale e scelta 💵 contanti / 🏦 bonifico</w:t>
       </w:r>
     </w:p>
     <w:p>
@@ -12439,7 +12229,7 @@
           <w:sz w:val="20"/>
           <w:szCs w:val="20"/>
         </w:rPr>
-        <w:t xml:space="preserve">Riga "🏦 Prestiti &amp; Mutuo" (indentata): appare SOLO se appPrefs.loans.length &gt; 0</w:t>
+        <w:t xml:space="preserve">Flag _flagged su righe da rivedere → sfondo arancione</w:t>
       </w:r>
     </w:p>
     <w:p>
@@ -12457,7 +12247,49 @@
           <w:sz w:val="20"/>
           <w:szCs w:val="20"/>
         </w:rPr>
-        <w:t xml:space="preserve">Se loans.length === 0: "◎ Risparmio Lordo" → direttamente "✓ Risparmio Netto"</w:t>
+        <w:t xml:space="preserve">Fix reale (ricalcolo split): quando lo stesso mese riceveva più bonifici verso Satispay, ogni transazione risultava taggata con la quota PIENA invece che con la propria quota — sostituito il bottone "Ripulisci duplicati" con "🧹 Ricalcola abbinamenti", formula unica valida sia per il fondo principale che per il delta; ogni split porta ora il tag _potId per riconoscere in modo affidabile quali transazioni appartengono a quale fondo</w:t>
+      </w:r>
+    </w:p>
+    <w:p>
+      <w:pPr>
+        <w:spacing w:after="60" w:before="60"/>
+      </w:pPr>
+      <w:r>
+        <w:t xml:space="preserve"/>
+      </w:r>
+    </w:p>
+    <w:p>
+      <w:pPr>
+        <w:pStyle w:val="Heading2"/>
+        <w:spacing w:after="80" w:before="220"/>
+      </w:pPr>
+      <w:r>
+        <w:rPr>
+          <w:rFonts w:ascii="Arial" w:cs="Arial" w:eastAsia="Arial" w:hAnsi="Arial"/>
+          <w:b/>
+          <w:bCs/>
+          <w:color w:val="34495E"/>
+          <w:sz w:val="24"/>
+          <w:szCs w:val="24"/>
+        </w:rPr>
+        <w:t xml:space="preserve">Forecast — ForecastPage.jsx</w:t>
+      </w:r>
+    </w:p>
+    <w:p>
+      <w:pPr>
+        <w:spacing w:after="40" w:before="140"/>
+      </w:pPr>
+      <w:r>
+        <w:rPr>
+          <w:rFonts w:ascii="Arial" w:cs="Arial" w:eastAsia="Arial" w:hAnsi="Arial"/>
+          <w:b/>
+          <w:bCs/>
+          <w:color w:val="34495E"/>
+          <w:i/>
+          <w:sz w:val="20"/>
+          <w:szCs w:val="20"/>
+        </w:rPr>
+        <w:t xml:space="preserve">Basi del calcolo: Storico vs Teoriche</w:t>
       </w:r>
     </w:p>
     <w:p>
@@ -12475,32 +12307,7 @@
           <w:sz w:val="20"/>
           <w:szCs w:val="20"/>
         </w:rPr>
-        <w:t xml:space="preserve">Se loans.length &gt; 0: Risparmio Lordo → Prestiti &amp; Mutuo (negativo) → Risparmio Netto</w:t>
-      </w:r>
-    </w:p>
-    <w:p>
-      <w:pPr>
-        <w:spacing w:after="60" w:before="60"/>
-      </w:pPr>
-      <w:r>
-        <w:t xml:space="preserve"/>
-      </w:r>
-    </w:p>
-    <w:p>
-      <w:pPr>
-        <w:pStyle w:val="Heading2"/>
-        <w:spacing w:after="80" w:before="220"/>
-      </w:pPr>
-      <w:r>
-        <w:rPr>
-          <w:rFonts w:ascii="Arial" w:cs="Arial" w:eastAsia="Arial" w:hAnsi="Arial"/>
-          <w:b/>
-          <w:bCs/>
-          <w:color w:val="34495E"/>
-          <w:sz w:val="24"/>
-          <w:szCs w:val="24"/>
-        </w:rPr>
-        <w:t xml:space="preserve">Prestiti &amp; Mutuo — MutuoPage.jsx</w:t>
+        <w:t xml:space="preserve">Selettore forecastBasis (appPrefs.forecastBasis): "Storico" usa la media reale degli ultimi 12 mesi per categoria (catStats, condivisa con Uscite/What-If); "Teoriche" usa valori manuali impostati dall’utente in Dati Base Previsione</w:t>
       </w:r>
     </w:p>
     <w:p>
@@ -12515,10 +12322,20 @@
       <w:r>
         <w:rPr>
           <w:rFonts w:ascii="Arial" w:cs="Arial" w:eastAsia="Arial" w:hAnsi="Arial"/>
-          <w:sz w:val="20"/>
-          <w:szCs w:val="20"/>
-        </w:rPr>
-        <w:t xml:space="preserve">Lista prestiti/mutui: nome, tipo (mutuo/prestito/leasing), istituto, importo iniziale, residuo, rata mensile, tasso (fisso/variabile), data inizio, data fine</w:t>
+          <w:b/>
+          <w:bCs/>
+          <w:sz w:val="20"/>
+          <w:szCs w:val="20"/>
+        </w:rPr>
+        <w:t xml:space="preserve">Teoriche &gt; Spese: </w:t>
+      </w:r>
+      <w:r>
+        <w:rPr>
+          <w:rFonts w:ascii="Arial" w:cs="Arial" w:eastAsia="Arial" w:hAnsi="Arial"/>
+          <w:sz w:val="20"/>
+          <w:szCs w:val="20"/>
+        </w:rPr>
+        <w:t xml:space="preserve">ogni categoria L1 è espandibile per modificare anche le sotto-categorie L2 (non solo il totale L1), stile piatto come il pannello What-if</w:t>
       </w:r>
     </w:p>
     <w:p>
@@ -12533,10 +12350,20 @@
       <w:r>
         <w:rPr>
           <w:rFonts w:ascii="Arial" w:cs="Arial" w:eastAsia="Arial" w:hAnsi="Arial"/>
-          <w:sz w:val="20"/>
-          <w:szCs w:val="20"/>
-        </w:rPr>
-        <w:t xml:space="preserve">KPI totali: somma totale debiti, rata mensile aggregata, numero prestiti attivi, % rata su reddito</w:t>
+          <w:b/>
+          <w:bCs/>
+          <w:sz w:val="20"/>
+          <w:szCs w:val="20"/>
+        </w:rPr>
+        <w:t xml:space="preserve">Selettore mesi storici (Teoriche &gt; Spese): </w:t>
+      </w:r>
+      <w:r>
+        <w:rPr>
+          <w:rFonts w:ascii="Arial" w:cs="Arial" w:eastAsia="Arial" w:hAnsi="Arial"/>
+          <w:sz w:val="20"/>
+          <w:szCs w:val="20"/>
+        </w:rPr>
+        <w:t xml:space="preserve">month-picker per scegliere quali mesi passati entrano nella media (catStatsTeoriche, calcolata su una finestra indipendente dai 12 mesi fissi di catStats — fino a 24 mesi grezzi disponibili)</w:t>
       </w:r>
     </w:p>
     <w:p>
@@ -12554,7 +12381,7 @@
           <w:sz w:val="20"/>
           <w:szCs w:val="20"/>
         </w:rPr>
-        <w:t xml:space="preserve">Barra progresso rimborso per ogni prestito: visuale % pagato</w:t>
+        <w:t xml:space="preserve">Cambiare la selezione mesi mostra un popup di conferma ("vuoi resettare le modifiche alla colonna Spese Mensili/Annue?") se esistono override manuali L1/L2 o override puntuali mese/anno, per evitare che restino valori scollegati dalla nuova media</w:t>
       </w:r>
     </w:p>
     <w:p>
@@ -12569,10 +12396,746 @@
       <w:r>
         <w:rPr>
           <w:rFonts w:ascii="Arial" w:cs="Arial" w:eastAsia="Arial" w:hAnsi="Arial"/>
+          <w:b/>
+          <w:bCs/>
+          <w:sz w:val="20"/>
+          <w:szCs w:val="20"/>
+        </w:rPr>
+        <w:t xml:space="preserve">Teoriche &gt; Entrate: </w:t>
+      </w:r>
+      <w:r>
+        <w:rPr>
+          <w:rFonts w:ascii="Arial" w:cs="Arial" w:eastAsia="Arial" w:hAnsi="Arial"/>
+          <w:sz w:val="20"/>
+          <w:szCs w:val="20"/>
+        </w:rPr>
+        <w:t xml:space="preserve">media modificabile per Fra/Sofi (click sul nome mostra lo storico 12 mesi) + 13ª/14ª mensilità con mese di pagamento configurabile</w:t>
+      </w:r>
+    </w:p>
+    <w:p>
+      <w:pPr>
+        <w:spacing w:after="40" w:before="140"/>
+      </w:pPr>
+      <w:r>
+        <w:rPr>
+          <w:rFonts w:ascii="Arial" w:cs="Arial" w:eastAsia="Arial" w:hAnsi="Arial"/>
+          <w:b/>
+          <w:bCs/>
+          <w:color w:val="34495E"/>
+          <w:i/>
+          <w:sz w:val="20"/>
+          <w:szCs w:val="20"/>
+        </w:rPr>
+        <w:t xml:space="preserve">Override puntuali per mese/anno</w:t>
+      </w:r>
+    </w:p>
+    <w:p>
+      <w:pPr>
+        <w:pStyle w:val="ListParagraph"/>
+        <w:numPr>
+          <w:ilvl w:val="0"/>
+          <w:numId w:val="2"/>
+        </w:numPr>
+        <w:spacing w:after="36" w:before="36"/>
+      </w:pPr>
+      <w:r>
+        <w:rPr>
+          <w:rFonts w:ascii="Arial" w:cs="Arial" w:eastAsia="Arial" w:hAnsi="Arial"/>
+          <w:sz w:val="20"/>
+          <w:szCs w:val="20"/>
+        </w:rPr>
+        <w:t xml:space="preserve">Click sulla colonna Spese Mensili/Annue in Proiezione (non sull’intera riga) apre il popup "Modifica spese — &lt;mese/anno&gt;": valori L1 precompilati dai default, espandibili in L2, con scelta "solo questo periodo" oppure "da qui in poi" (cascata)</w:t>
+      </w:r>
+    </w:p>
+    <w:p>
+      <w:pPr>
+        <w:pStyle w:val="ListParagraph"/>
+        <w:numPr>
+          <w:ilvl w:val="0"/>
+          <w:numId w:val="2"/>
+        </w:numPr>
+        <w:spacing w:after="36" w:before="36"/>
+      </w:pPr>
+      <w:r>
+        <w:rPr>
+          <w:rFonts w:ascii="Arial" w:cs="Arial" w:eastAsia="Arial" w:hAnsi="Arial"/>
+          <w:sz w:val="20"/>
+          <w:szCs w:val="20"/>
+        </w:rPr>
+        <w:t xml:space="preserve">Bottone "Ripristina ai valori attuali" nel popup Modifica Spese: riporta tutti i valori ai default correnti (catStats o catStatsTeoriche a seconda della base attiva) e azzera le espansioni L2</w:t>
+      </w:r>
+    </w:p>
+    <w:p>
+      <w:pPr>
+        <w:pStyle w:val="ListParagraph"/>
+        <w:numPr>
+          <w:ilvl w:val="0"/>
+          <w:numId w:val="2"/>
+        </w:numPr>
+        <w:spacing w:after="36" w:before="36"/>
+      </w:pPr>
+      <w:r>
+        <w:rPr>
+          <w:rFonts w:ascii="Arial" w:cs="Arial" w:eastAsia="Arial" w:hAnsi="Arial"/>
+          <w:sz w:val="20"/>
+          <w:szCs w:val="20"/>
+        </w:rPr>
+        <w:t xml:space="preserve">Se l’utente riapre il selettore mesi storici di Teoriche &gt; Spese con override puntuali già presenti, il popup di conferma reset copre anche overridesMonthly/overridesYearly, non solo i valori L1/L2 di Teoriche</w:t>
+      </w:r>
+    </w:p>
+    <w:p>
+      <w:pPr>
+        <w:pStyle w:val="ListParagraph"/>
+        <w:numPr>
+          <w:ilvl w:val="0"/>
+          <w:numId w:val="2"/>
+        </w:numPr>
+        <w:spacing w:after="36" w:before="36"/>
+      </w:pPr>
+      <w:r>
+        <w:rPr>
+          <w:rFonts w:ascii="Arial" w:cs="Arial" w:eastAsia="Arial" w:hAnsi="Arial"/>
+          <w:sz w:val="20"/>
+          <w:szCs w:val="20"/>
+        </w:rPr>
+        <w:t xml:space="preserve">Click sulla colonna Entrate in Proiezione apre il popup "Modifica entrate": Fra/Sofi con cascata indipendente + riga "Altro" per un’entrata extra one-off con flag cascata proprio</w:t>
+      </w:r>
+    </w:p>
+    <w:p>
+      <w:pPr>
+        <w:pStyle w:val="ListParagraph"/>
+        <w:numPr>
+          <w:ilvl w:val="0"/>
+          <w:numId w:val="2"/>
+        </w:numPr>
+        <w:spacing w:after="36" w:before="36"/>
+      </w:pPr>
+      <w:r>
+        <w:rPr>
+          <w:rFonts w:ascii="Arial" w:cs="Arial" w:eastAsia="Arial" w:hAnsi="Arial"/>
+          <w:sz w:val="20"/>
+          <w:szCs w:val="20"/>
+        </w:rPr>
+        <w:t xml:space="preserve">Persistenza: overridesMonthly/overridesYearly (spese) e overridesEntrateMonthly/overridesEntrateYearly (entrate) in appPrefs — sopravvivono alla chiusura della pagina</w:t>
+      </w:r>
+    </w:p>
+    <w:p>
+      <w:pPr>
+        <w:pStyle w:val="ListParagraph"/>
+        <w:numPr>
+          <w:ilvl w:val="0"/>
+          <w:numId w:val="2"/>
+        </w:numPr>
+        <w:spacing w:after="36" w:before="36"/>
+      </w:pPr>
+      <w:r>
+        <w:rPr>
+          <w:rFonts w:ascii="Arial" w:cs="Arial" w:eastAsia="Arial" w:hAnsi="Arial"/>
+          <w:sz w:val="20"/>
+          <w:szCs w:val="20"/>
+        </w:rPr>
+        <w:t xml:space="preserve">Bug corretto (2026-07-23): il loop di calcolo Annuale (chart e tabella "Proiezione Annuale") leggeva solo gli override Yearly, ignorando quelli Monthly che cadevano dentro l’anno — ora somma mese per mese (override mensile, poi annuale, poi valore ricorrente) e fa la media sui mesi dell’anno, così Annuale e Mensile restano coerenti</w:t>
+      </w:r>
+    </w:p>
+    <w:p>
+      <w:pPr>
+        <w:spacing w:after="40" w:before="140"/>
+      </w:pPr>
+      <w:r>
+        <w:rPr>
+          <w:rFonts w:ascii="Arial" w:cs="Arial" w:eastAsia="Arial" w:hAnsi="Arial"/>
+          <w:b/>
+          <w:bCs/>
+          <w:color w:val="34495E"/>
+          <w:i/>
+          <w:sz w:val="20"/>
+          <w:szCs w:val="20"/>
+        </w:rPr>
+        <w:t xml:space="preserve">Motore Mutuo integrato in Forecast</w:t>
+      </w:r>
+    </w:p>
+    <w:p>
+      <w:pPr>
+        <w:pStyle w:val="ListParagraph"/>
+        <w:numPr>
+          <w:ilvl w:val="0"/>
+          <w:numId w:val="2"/>
+        </w:numPr>
+        <w:spacing w:after="36" w:before="36"/>
+      </w:pPr>
+      <w:r>
+        <w:rPr>
+          <w:rFonts w:ascii="Arial" w:cs="Arial" w:eastAsia="Arial" w:hAnsi="Arial"/>
+          <w:sz w:val="20"/>
+          <w:szCs w:val="20"/>
+        </w:rPr>
+        <w:t xml:space="preserve">Configurazione mutuo (appPrefs.forecastMortgage): importo, TAEG, durata anni, data inizio, anticipo — indipendente dalla pagina "Prestiti &amp; Mutuo" (elenco generico prestiti)</w:t>
+      </w:r>
+    </w:p>
+    <w:p>
+      <w:pPr>
+        <w:pStyle w:val="ListParagraph"/>
+        <w:numPr>
+          <w:ilvl w:val="0"/>
+          <w:numId w:val="2"/>
+        </w:numPr>
+        <w:spacing w:after="36" w:before="36"/>
+      </w:pPr>
+      <w:r>
+        <w:rPr>
+          <w:rFonts w:ascii="Arial" w:cs="Arial" w:eastAsia="Arial" w:hAnsi="Arial"/>
+          <w:sz w:val="20"/>
+          <w:szCs w:val="20"/>
+        </w:rPr>
+        <w:t xml:space="preserve">mortgageNotYetStarted: anticipo ed erogazione capitale si applicano SOLO se il mutuo non è ancora iniziato rispetto a oggi, mai retroattivamente su un mutuo già attivo</w:t>
+      </w:r>
+    </w:p>
+    <w:p>
+      <w:pPr>
+        <w:pStyle w:val="ListParagraph"/>
+        <w:numPr>
+          <w:ilvl w:val="0"/>
+          <w:numId w:val="2"/>
+        </w:numPr>
+        <w:spacing w:after="36" w:before="36"/>
+      </w:pPr>
+      <w:r>
+        <w:rPr>
+          <w:rFonts w:ascii="Arial" w:cs="Arial" w:eastAsia="Arial" w:hAnsi="Arial"/>
+          <w:sz w:val="20"/>
+          <w:szCs w:val="20"/>
+        </w:rPr>
+        <w:t xml:space="preserve">Nel mese/anno di inizio, l’importo pieno del mutuo (mortgageAmt) viene accreditato come ENTRATA in colonna Entrate Mensile/Annuale (evidenziata con sfondo arancione + tooltip), oltre a ridurre il saldo dell’eventuale anticipo</w:t>
+      </w:r>
+    </w:p>
+    <w:p>
+      <w:pPr>
+        <w:pStyle w:val="ListParagraph"/>
+        <w:numPr>
+          <w:ilvl w:val="0"/>
+          <w:numId w:val="2"/>
+        </w:numPr>
+        <w:spacing w:after="36" w:before="36"/>
+      </w:pPr>
+      <w:r>
+        <w:rPr>
+          <w:rFonts w:ascii="Arial" w:cs="Arial" w:eastAsia="Arial" w:hAnsi="Arial"/>
+          <w:b/>
+          <w:bCs/>
+          <w:sz w:val="20"/>
+          <w:szCs w:val="20"/>
+        </w:rPr>
+        <w:t xml:space="preserve">Rimborso anticipato automatico ogni X risparmiati (extraRepayEnabled/extraRepayThreshold): </w:t>
+      </w:r>
+      <w:r>
+        <w:rPr>
+          <w:rFonts w:ascii="Arial" w:cs="Arial" w:eastAsia="Arial" w:hAnsi="Arial"/>
+          <w:sz w:val="20"/>
+          <w:szCs w:val="20"/>
+        </w:rPr>
+        <w:t xml:space="preserve">quando il saldo simulato supera una baseline di una soglia configurabile, l’eccedenza (arrotondata a multipli della soglia) viene versata extra sul mutuo quel mese/anno</w:t>
+      </w:r>
+    </w:p>
+    <w:p>
+      <w:pPr>
+        <w:pStyle w:val="ListParagraph"/>
+        <w:numPr>
+          <w:ilvl w:val="0"/>
+          <w:numId w:val="2"/>
+        </w:numPr>
+        <w:spacing w:after="36" w:before="36"/>
+      </w:pPr>
+      <w:r>
+        <w:rPr>
+          <w:rFonts w:ascii="Arial" w:cs="Arial" w:eastAsia="Arial" w:hAnsi="Arial"/>
+          <w:sz w:val="20"/>
+          <w:szCs w:val="20"/>
+        </w:rPr>
+        <w:t xml:space="preserve">La baseline (extraBaseSaldo) viene catturata DOPO i flussi (entrate/spese/rata) del mese o anno di inizio simulazione, non prima — altrimenti un’erogazione capitale seguita da una spesa di pari importo nello stesso periodo alzava la baseline oltre ogni soglia raggiungibile in futuro (bug reale corretto il 2026-07-23)</w:t>
+      </w:r>
+    </w:p>
+    <w:p>
+      <w:pPr>
+        <w:pStyle w:val="ListParagraph"/>
+        <w:numPr>
+          <w:ilvl w:val="0"/>
+          <w:numId w:val="2"/>
+        </w:numPr>
+        <w:spacing w:after="36" w:before="36"/>
+      </w:pPr>
+      <w:r>
+        <w:rPr>
+          <w:rFonts w:ascii="Arial" w:cs="Arial" w:eastAsia="Arial" w:hAnsi="Arial"/>
+          <w:sz w:val="20"/>
+          <w:szCs w:val="20"/>
+        </w:rPr>
+        <w:t xml:space="preserve">Nessun rimborso anticipato automatico può scattare nel primissimo mese/anno di mutuo attivo (mortMonthsElapsed &gt; 0 richiesto), anche se il saldo di quel periodo da solo supererebbe la soglia</w:t>
+      </w:r>
+    </w:p>
+    <w:p>
+      <w:pPr>
+        <w:pStyle w:val="ListParagraph"/>
+        <w:numPr>
+          <w:ilvl w:val="0"/>
+          <w:numId w:val="2"/>
+        </w:numPr>
+        <w:spacing w:after="36" w:before="36"/>
+      </w:pPr>
+      <w:r>
+        <w:rPr>
+          <w:rFonts w:ascii="Arial" w:cs="Arial" w:eastAsia="Arial" w:hAnsi="Arial"/>
+          <w:sz w:val="20"/>
+          <w:szCs w:val="20"/>
+        </w:rPr>
+        <w:t xml:space="preserve">extraRepayStrategy: "Riduci la rata" ricalcola la rata mensile sul capitale residuo/durata rimanente; "Riduci la durata" mantiene la rata invariata e accorcia naturalmente la durata</w:t>
+      </w:r>
+    </w:p>
+    <w:p>
+      <w:pPr>
+        <w:pStyle w:val="ListParagraph"/>
+        <w:numPr>
+          <w:ilvl w:val="0"/>
+          <w:numId w:val="2"/>
+        </w:numPr>
+        <w:spacing w:after="36" w:before="36"/>
+      </w:pPr>
+      <w:r>
+        <w:rPr>
+          <w:rFonts w:ascii="Arial" w:cs="Arial" w:eastAsia="Arial" w:hAnsi="Arial"/>
+          <w:sz w:val="20"/>
+          <w:szCs w:val="20"/>
+        </w:rPr>
+        <w:t xml:space="preserve">Estinzione manuale: click sulla cella Rata Mutuo in tabella apre popup per versare un extra one-off (stessa scadenza, rata ricalcolata)</w:t>
+      </w:r>
+    </w:p>
+    <w:p>
+      <w:pPr>
+        <w:pStyle w:val="ListParagraph"/>
+        <w:numPr>
+          <w:ilvl w:val="0"/>
+          <w:numId w:val="2"/>
+        </w:numPr>
+        <w:spacing w:after="36" w:before="36"/>
+      </w:pPr>
+      <w:r>
+        <w:rPr>
+          <w:rFonts w:ascii="Arial" w:cs="Arial" w:eastAsia="Arial" w:hAnsi="Arial"/>
+          <w:sz w:val="20"/>
+          <w:szCs w:val="20"/>
+        </w:rPr>
+        <w:t xml:space="preserve">Cella Rata Mutuo: quando c’è un’estinzione (auto o manuale) mostra un importo unico rata+estinzione con sfondo rosso e segno negativo, invece di sommarlo separatamente</w:t>
+      </w:r>
+    </w:p>
+    <w:p>
+      <w:pPr>
+        <w:spacing w:after="40" w:before="140"/>
+      </w:pPr>
+      <w:r>
+        <w:rPr>
+          <w:rFonts w:ascii="Arial" w:cs="Arial" w:eastAsia="Arial" w:hAnsi="Arial"/>
+          <w:b/>
+          <w:bCs/>
+          <w:color w:val="34495E"/>
+          <w:i/>
+          <w:sz w:val="20"/>
+          <w:szCs w:val="20"/>
+        </w:rPr>
+        <w:t xml:space="preserve">Chart e KPI Mutuo</w:t>
+      </w:r>
+    </w:p>
+    <w:p>
+      <w:pPr>
+        <w:pStyle w:val="ListParagraph"/>
+        <w:numPr>
+          <w:ilvl w:val="0"/>
+          <w:numId w:val="2"/>
+        </w:numPr>
+        <w:spacing w:after="36" w:before="36"/>
+      </w:pPr>
+      <w:r>
+        <w:rPr>
+          <w:rFonts w:ascii="Arial" w:cs="Arial" w:eastAsia="Arial" w:hAnsi="Arial"/>
+          <w:sz w:val="20"/>
+          <w:szCs w:val="20"/>
+        </w:rPr>
+        <w:t xml:space="preserve">Se il rimborso anticipato automatico è attivo, il chart mostra anche la linea "Mutuo originale" (grigia tratteggiata): il piano di ammortamento nominale, calcolato con calcMortgage() sui parametri base, indipendente da extraRepayEnabled — utile per confrontare il risparmio reale ottenuto</w:t>
+      </w:r>
+    </w:p>
+    <w:p>
+      <w:pPr>
+        <w:pStyle w:val="ListParagraph"/>
+        <w:numPr>
+          <w:ilvl w:val="0"/>
+          <w:numId w:val="2"/>
+        </w:numPr>
+        <w:spacing w:after="36" w:before="36"/>
+      </w:pPr>
+      <w:r>
+        <w:rPr>
+          <w:rFonts w:ascii="Arial" w:cs="Arial" w:eastAsia="Arial" w:hAnsi="Arial"/>
+          <w:sz w:val="20"/>
+          <w:szCs w:val="20"/>
+        </w:rPr>
+        <w:t xml:space="preserve">KPI "Mutuo estinto": mostra l’anno nominale (senza rimborso anticipato) come valore principale; se il rimborso anticipato è attivo e anticipa la scadenza, l’anno effettivo appare in un angolino come valore secondario</w:t>
+      </w:r>
+    </w:p>
+    <w:p>
+      <w:pPr>
+        <w:pStyle w:val="ListParagraph"/>
+        <w:numPr>
+          <w:ilvl w:val="0"/>
+          <w:numId w:val="2"/>
+        </w:numPr>
+        <w:spacing w:after="36" w:before="36"/>
+      </w:pPr>
+      <w:r>
+        <w:rPr>
+          <w:rFonts w:ascii="Arial" w:cs="Arial" w:eastAsia="Arial" w:hAnsi="Arial"/>
+          <w:sz w:val="20"/>
+          <w:szCs w:val="20"/>
+        </w:rPr>
+        <w:t xml:space="preserve">Nuovi KPI "Quota capitale" e "Quota interessi" (quota corrente della rata): stesso pattern valore nominale/reale in angolino quando differiscono</w:t>
+      </w:r>
+    </w:p>
+    <w:p>
+      <w:pPr>
+        <w:spacing w:after="40" w:before="140"/>
+      </w:pPr>
+      <w:r>
+        <w:rPr>
+          <w:rFonts w:ascii="Arial" w:cs="Arial" w:eastAsia="Arial" w:hAnsi="Arial"/>
+          <w:b/>
+          <w:bCs/>
+          <w:color w:val="34495E"/>
+          <w:i/>
+          <w:sz w:val="20"/>
+          <w:szCs w:val="20"/>
+        </w:rPr>
+        <w:t xml:space="preserve">Colori e formattazione tabella Proiezione</w:t>
+      </w:r>
+    </w:p>
+    <w:p>
+      <w:pPr>
+        <w:pStyle w:val="ListParagraph"/>
+        <w:numPr>
+          <w:ilvl w:val="0"/>
+          <w:numId w:val="2"/>
+        </w:numPr>
+        <w:spacing w:after="36" w:before="36"/>
+      </w:pPr>
+      <w:r>
+        <w:rPr>
+          <w:rFonts w:ascii="Arial" w:cs="Arial" w:eastAsia="Arial" w:hAnsi="Arial"/>
+          <w:sz w:val="20"/>
+          <w:szCs w:val="20"/>
+        </w:rPr>
+        <w:t xml:space="preserve">Tabella "Proiezione Annuale €" e "Proiezione Mensile €": ogni numero è colorato in base al proprio segno — verde se ≥ 0, rosso se negativo (spese e rata mutuo mostrate con prefisso "−"); il Residuo Mutuo resta sempre verde (non può essere negativo)</w:t>
+      </w:r>
+    </w:p>
+    <w:p>
+      <w:pPr>
+        <w:pStyle w:val="ListParagraph"/>
+        <w:numPr>
+          <w:ilvl w:val="0"/>
+          <w:numId w:val="2"/>
+        </w:numPr>
+        <w:spacing w:after="36" w:before="36"/>
+      </w:pPr>
+      <w:r>
+        <w:rPr>
+          <w:rFonts w:ascii="Arial" w:cs="Arial" w:eastAsia="Arial" w:hAnsi="Arial"/>
+          <w:sz w:val="20"/>
+          <w:szCs w:val="20"/>
+        </w:rPr>
+        <w:t xml:space="preserve">Le celle con un override attivo (spese o entrate) mostrano uno sfondo colorato + tooltip invece della precedente icona matita/fulmine</w:t>
+      </w:r>
+    </w:p>
+    <w:p>
+      <w:pPr>
+        <w:pStyle w:val="Heading2"/>
+        <w:spacing w:after="80" w:before="220"/>
+      </w:pPr>
+      <w:r>
+        <w:rPr>
+          <w:rFonts w:ascii="Arial" w:cs="Arial" w:eastAsia="Arial" w:hAnsi="Arial"/>
+          <w:b/>
+          <w:bCs/>
+          <w:color w:val="34495E"/>
+          <w:sz w:val="24"/>
+          <w:szCs w:val="24"/>
+        </w:rPr>
+        <w:t xml:space="preserve">Prestiti &amp; Mutuo — MutuoPage.jsx</w:t>
+      </w:r>
+    </w:p>
+    <w:p>
+      <w:pPr>
+        <w:pStyle w:val="ListParagraph"/>
+        <w:numPr>
+          <w:ilvl w:val="0"/>
+          <w:numId w:val="2"/>
+        </w:numPr>
+        <w:spacing w:after="36" w:before="36"/>
+      </w:pPr>
+      <w:r>
+        <w:rPr>
+          <w:rFonts w:ascii="Arial" w:cs="Arial" w:eastAsia="Arial" w:hAnsi="Arial"/>
+          <w:sz w:val="20"/>
+          <w:szCs w:val="20"/>
+        </w:rPr>
+        <w:t xml:space="preserve">Lista prestiti/mutui: nome, tipo (mutuo/prestito/leasing), istituto, importo iniziale, residuo, rata mensile, tasso (fisso/variabile), data inizio, data fine</w:t>
+      </w:r>
+    </w:p>
+    <w:p>
+      <w:pPr>
+        <w:pStyle w:val="ListParagraph"/>
+        <w:numPr>
+          <w:ilvl w:val="0"/>
+          <w:numId w:val="2"/>
+        </w:numPr>
+        <w:spacing w:after="36" w:before="36"/>
+      </w:pPr>
+      <w:r>
+        <w:rPr>
+          <w:rFonts w:ascii="Arial" w:cs="Arial" w:eastAsia="Arial" w:hAnsi="Arial"/>
+          <w:sz w:val="20"/>
+          <w:szCs w:val="20"/>
+        </w:rPr>
+        <w:t xml:space="preserve">KPI totali: somma totale debiti, rata mensile aggregata, numero prestiti attivi, % rata su reddito</w:t>
+      </w:r>
+    </w:p>
+    <w:p>
+      <w:pPr>
+        <w:pStyle w:val="ListParagraph"/>
+        <w:numPr>
+          <w:ilvl w:val="0"/>
+          <w:numId w:val="2"/>
+        </w:numPr>
+        <w:spacing w:after="36" w:before="36"/>
+      </w:pPr>
+      <w:r>
+        <w:rPr>
+          <w:rFonts w:ascii="Arial" w:cs="Arial" w:eastAsia="Arial" w:hAnsi="Arial"/>
+          <w:sz w:val="20"/>
+          <w:szCs w:val="20"/>
+        </w:rPr>
+        <w:t xml:space="preserve">Barra progresso rimborso per ogni prestito: visuale % pagato</w:t>
+      </w:r>
+    </w:p>
+    <w:p>
+      <w:pPr>
+        <w:pStyle w:val="ListParagraph"/>
+        <w:numPr>
+          <w:ilvl w:val="0"/>
+          <w:numId w:val="2"/>
+        </w:numPr>
+        <w:spacing w:after="36" w:before="36"/>
+      </w:pPr>
+      <w:r>
+        <w:rPr>
+          <w:rFonts w:ascii="Arial" w:cs="Arial" w:eastAsia="Arial" w:hAnsi="Arial"/>
           <w:sz w:val="20"/>
           <w:szCs w:val="20"/>
         </w:rPr>
         <w:t xml:space="preserve">Simulatore rata integrato: inserisci importo + tasso + durata → calcola rata mensile, totale interessi, totale rimborso</w:t>
+      </w:r>
+    </w:p>
+    <w:p>
+      <w:pPr>
+        <w:spacing w:after="60" w:before="60"/>
+      </w:pPr>
+      <w:r>
+        <w:t xml:space="preserve"/>
+      </w:r>
+    </w:p>
+    <w:p>
+      <w:pPr>
+        <w:pStyle w:val="Heading2"/>
+        <w:spacing w:after="80" w:before="220"/>
+      </w:pPr>
+      <w:r>
+        <w:rPr>
+          <w:rFonts w:ascii="Arial" w:cs="Arial" w:eastAsia="Arial" w:hAnsi="Arial"/>
+          <w:b/>
+          <w:bCs/>
+          <w:color w:val="34495E"/>
+          <w:sz w:val="24"/>
+          <w:szCs w:val="24"/>
+        </w:rPr>
+        <w:t xml:space="preserve">Altre Entrate e Sistema di Compensazione — AltreEntratePage.jsx</w:t>
+      </w:r>
+    </w:p>
+    <w:p>
+      <w:pPr>
+        <w:pStyle w:val="ListParagraph"/>
+        <w:numPr>
+          <w:ilvl w:val="0"/>
+          <w:numId w:val="2"/>
+        </w:numPr>
+        <w:spacing w:after="36" w:before="36"/>
+      </w:pPr>
+      <w:r>
+        <w:rPr>
+          <w:rFonts w:ascii="Arial" w:cs="Arial" w:eastAsia="Arial" w:hAnsi="Arial"/>
+          <w:sz w:val="20"/>
+          <w:szCs w:val="20"/>
+        </w:rPr>
+        <w:t xml:space="preserve">Elenco entrate extra (rimborsi, bonus, prestiti ricevuti) con colonna Codice Transazione e colonna Residuo, che calcola sempre entryResidual() — mai un valore statico salvato altrove</w:t>
+      </w:r>
+    </w:p>
+    <w:p>
+      <w:pPr>
+        <w:pStyle w:val="ListParagraph"/>
+        <w:numPr>
+          <w:ilvl w:val="0"/>
+          <w:numId w:val="2"/>
+        </w:numPr>
+        <w:spacing w:after="36" w:before="36"/>
+      </w:pPr>
+      <w:r>
+        <w:rPr>
+          <w:rFonts w:ascii="Arial" w:cs="Arial" w:eastAsia="Arial" w:hAnsi="Arial"/>
+          <w:b/>
+          <w:bCs/>
+          <w:sz w:val="20"/>
+          <w:szCs w:val="20"/>
+        </w:rPr>
+        <w:t xml:space="preserve">Terminologia unificata "compensa/compensata" </w:t>
+      </w:r>
+      <w:r>
+        <w:rPr>
+          <w:rFonts w:ascii="Arial" w:cs="Arial" w:eastAsia="Arial" w:hAnsi="Arial"/>
+          <w:sz w:val="20"/>
+          <w:szCs w:val="20"/>
+        </w:rPr>
+        <w:t xml:space="preserve">(non più "abbina/abbinata"): quando una spesa viene rettificata al netto perché coperta in parte o del tutto da un'entrata (es. rimborso), il sistema parla di compensazione — stessa terminologia anche in Transazioni e Carte di Credito</w:t>
+      </w:r>
+    </w:p>
+    <w:p>
+      <w:pPr>
+        <w:pStyle w:val="ListParagraph"/>
+        <w:numPr>
+          <w:ilvl w:val="0"/>
+          <w:numId w:val="2"/>
+        </w:numPr>
+        <w:spacing w:after="36" w:before="36"/>
+      </w:pPr>
+      <w:r>
+        <w:rPr>
+          <w:rFonts w:ascii="Arial" w:cs="Arial" w:eastAsia="Arial" w:hAnsi="Arial"/>
+          <w:sz w:val="20"/>
+          <w:szCs w:val="20"/>
+        </w:rPr>
+        <w:t xml:space="preserve">Toggle "solo non compensate" per filtrare la tabella Entrate Registrate</w:t>
+      </w:r>
+    </w:p>
+    <w:p>
+      <w:pPr>
+        <w:pStyle w:val="ListParagraph"/>
+        <w:numPr>
+          <w:ilvl w:val="0"/>
+          <w:numId w:val="2"/>
+        </w:numPr>
+        <w:spacing w:after="36" w:before="36"/>
+      </w:pPr>
+      <w:r>
+        <w:rPr>
+          <w:rFonts w:ascii="Arial" w:cs="Arial" w:eastAsia="Arial" w:hAnsi="Arial"/>
+          <w:sz w:val="20"/>
+          <w:szCs w:val="20"/>
+        </w:rPr>
+        <w:t xml:space="preserve">Import: click sull'importo rettificato di una spesa in Transazioni mostra il/i codice/i transazione dell'entrata compensante</w:t>
+      </w:r>
+    </w:p>
+    <w:p>
+      <w:pPr>
+        <w:pStyle w:val="ListParagraph"/>
+        <w:numPr>
+          <w:ilvl w:val="0"/>
+          <w:numId w:val="2"/>
+        </w:numPr>
+        <w:spacing w:after="36" w:before="36"/>
+      </w:pPr>
+      <w:r>
+        <w:rPr>
+          <w:rFonts w:ascii="Arial" w:cs="Arial" w:eastAsia="Arial" w:hAnsi="Arial"/>
+          <w:b/>
+          <w:bCs/>
+          <w:sz w:val="20"/>
+          <w:szCs w:val="20"/>
+        </w:rPr>
+        <w:t xml:space="preserve">Sistema unificato in src/data/compensation.js: </w:t>
+      </w:r>
+      <w:r>
+        <w:rPr>
+          <w:rFonts w:ascii="Arial" w:cs="Arial" w:eastAsia="Arial" w:hAnsi="Arial"/>
+          <w:sz w:val="20"/>
+          <w:szCs w:val="20"/>
+        </w:rPr>
+        <w:t xml:space="preserve">netAmt()/availableAmount()/compensateGroup() — usate ovunque nell'app dove serve calcolare il valore "netto" di una spesa rettificata (Uscite, Forecast, What-if, Weekend/Vacanze); qualunque nuova funzionalità che tocca compensazioni deve riusare queste funzioni, non reimplementare la somma</w:t>
+      </w:r>
+    </w:p>
+    <w:p>
+      <w:pPr>
+        <w:pStyle w:val="ListParagraph"/>
+        <w:numPr>
+          <w:ilvl w:val="0"/>
+          <w:numId w:val="2"/>
+        </w:numPr>
+        <w:spacing w:after="36" w:before="36"/>
+      </w:pPr>
+      <w:r>
+        <w:rPr>
+          <w:rFonts w:ascii="Arial" w:cs="Arial" w:eastAsia="Arial" w:hAnsi="Arial"/>
+          <w:sz w:val="20"/>
+          <w:szCs w:val="20"/>
+        </w:rPr>
+        <w:t xml:space="preserve">Compensazione multi-prelievo/multi-entrata: un'entrata può coprire più spese e viceversa; il residuo di ognuna è ricalcolato dinamicamente, non fissato al momento del collegamento</w:t>
+      </w:r>
+    </w:p>
+    <w:p>
+      <w:pPr>
+        <w:pStyle w:val="ListParagraph"/>
+        <w:numPr>
+          <w:ilvl w:val="0"/>
+          <w:numId w:val="2"/>
+        </w:numPr>
+        <w:spacing w:after="36" w:before="36"/>
+      </w:pPr>
+      <w:r>
+        <w:rPr>
+          <w:rFonts w:ascii="Arial" w:cs="Arial" w:eastAsia="Arial" w:hAnsi="Arial"/>
+          <w:b/>
+          <w:bCs/>
+          <w:sz w:val="20"/>
+          <w:szCs w:val="20"/>
+        </w:rPr>
+        <w:t xml:space="preserve">Bug reale corretto (task #85, 2026-07-23): </w:t>
+      </w:r>
+      <w:r>
+        <w:rPr>
+          <w:rFonts w:ascii="Arial" w:cs="Arial" w:eastAsia="Arial" w:hAnsi="Arial"/>
+          <w:sz w:val="20"/>
+          <w:szCs w:val="20"/>
+        </w:rPr>
+        <w:t xml:space="preserve">una spesa già rettificata correttamente in Transazioni poteva restare mostrata come entrata "da compensare" in Altre Entrate. Causa: la migrazione una tantum che retro-popola _compensatedAmt sul lato entrata (per compensazioni storiche scritte solo lato spesa) saltava i casi in cui _compensatedBy era un array (più entrate coinvolte), trattandoli come "ambigui". Fix in useStore.js: ogni entrata nell'array riceve ora l'attribuzione corretta (solo in aumento, mai in diminuzione, per restare idempotente)</w:t>
+      </w:r>
+    </w:p>
+    <w:p>
+      <w:pPr>
+        <w:pStyle w:val="ListParagraph"/>
+        <w:numPr>
+          <w:ilvl w:val="0"/>
+          <w:numId w:val="2"/>
+        </w:numPr>
+        <w:spacing w:after="36" w:before="36"/>
+      </w:pPr>
+      <w:r>
+        <w:rPr>
+          <w:rFonts w:ascii="Arial" w:cs="Arial" w:eastAsia="Arial" w:hAnsi="Arial"/>
+          <w:sz w:val="20"/>
+          <w:szCs w:val="20"/>
+        </w:rPr>
+        <w:t xml:space="preserve">Fallback difensivo in entryResidual() (AltreEntratePage.jsx): se compLinks e il campo diretto sull'entrata non bastano, una scansione a ritroso cerca tra le spese negative con _compensatedAmt valorizzato quelle che referenziano questa entrata in _compensatedBy — copre eventuali futuri percorsi di scrittura asimmetrica lato spesa</w:t>
       </w:r>
     </w:p>
     <w:p>
@@ -13437,96 +14000,6 @@
           <w:szCs w:val="20"/>
         </w:rPr>
         <w:t xml:space="preserve">Overlay “📆 Spese fuori periodo” / “🚩 Spese non allocate” (WeekendVacanzeV2Page): entrambe le tabelle mostrano ora anche la colonna “Competenza” (editabile) accanto a Data cont./Data valuta; il confronto con i periodi vacanza usa sempre competenza → data (mai la sola data valuta/contabile). In “📆 Spese fuori periodo”, assegnare la spesa a una vacanza esistente (select “Assegna a…”) ora sposta la competenza della spesa al primo giorno di quel periodo, invece di estendere le date della vacanza per coprirla (comportamento precedente)</w:t>
-      </w:r>
-    </w:p>
-    <w:p>
-      <w:pPr>
-        <w:pStyle w:val="ListParagraph"/>
-        <w:numPr>
-          <w:ilvl w:val="0"/>
-          <w:numId w:val="2"/>
-        </w:numPr>
-        <w:spacing w:after="36" w:before="36"/>
-      </w:pPr>
-      <w:r>
-        <w:rPr>
-          <w:rFonts w:ascii="Arial" w:cs="Arial" w:eastAsia="Arial" w:hAnsi="Arial"/>
-          <w:sz w:val="20"/>
-          <w:szCs w:val="20"/>
-        </w:rPr>
-        <w:t xml:space="preserve">Tipo (Vacanze/Weekend) di un periodo: normalmente derivato (cat2 dominante delle transazioni già assegnate, fallback su durata 3+ notti = Vacanze) tramite l’unica funzione vacationType() (data/vacationRules.js); può essere impostato manualmente cliccando il badge “Tipo” nella tabella annuale di WeekendVacanzeV2Page — persistito come typeOverride sul periodo, ha sempre priorità sul calcolo automatico</w:t>
-      </w:r>
-    </w:p>
-    <w:p>
-      <w:pPr>
-        <w:pStyle w:val="ListParagraph"/>
-        <w:numPr>
-          <w:ilvl w:val="0"/>
-          <w:numId w:val="2"/>
-        </w:numPr>
-        <w:spacing w:after="36" w:before="36"/>
-      </w:pPr>
-      <w:r>
-        <w:rPr>
-          <w:rFonts w:ascii="Arial" w:cs="Arial" w:eastAsia="Arial" w:hAnsi="Arial"/>
-          <w:sz w:val="20"/>
-          <w:szCs w:val="20"/>
-        </w:rPr>
-        <w:t xml:space="preserve">Pulsante unico “🔎 Revisione” (con badge di conteggio totale) raccoglie 3 pannelli in un solo punto d’accesso: “Spese non allocate” (spese avvenute durante una vacanza dichiarata ma non ancora categorizzate come tali), “📆 Spese fuori periodo” (spese già “Weekend e Vacanze” la cui data non cade in nessun periodo dichiarato), “🔍 Vacanze e weekend da confermare” (cluster di spesa candidati non ancora dichiarati come periodo) — ognuno apre lo stesso modale di prima, solo l’accesso è consolidato</w:t>
-      </w:r>
-    </w:p>
-    <w:p>
-      <w:pPr>
-        <w:pStyle w:val="ListParagraph"/>
-        <w:numPr>
-          <w:ilvl w:val="0"/>
-          <w:numId w:val="2"/>
-        </w:numPr>
-        <w:spacing w:after="36" w:before="36"/>
-      </w:pPr>
-      <w:r>
-        <w:rPr>
-          <w:rFonts w:ascii="Arial" w:cs="Arial" w:eastAsia="Arial" w:hAnsi="Arial"/>
-          <w:sz w:val="20"/>
-          <w:szCs w:val="20"/>
-        </w:rPr>
-        <w:t xml:space="preserve">“Spese non allocate” esclude automaticamente le spese nella città di riferimento dell’utente (Impostazioni → Zona di Casa) e le descrizioni AI marcate “MAI” tramite il pannello ⚙️ Escluse sempre (appPrefs.wv2NeverAiDescs) — un click su “MAI” accanto a una riga la esclude per sempre, ovunque compaia con quella stessa descrizione AI; selezione multipla con checkbox + “Accetta selezionate”/“Ignora selezionate”, tutte le azioni (singole o multiple) sono annullabili con “Annulla” (8s)</w:t>
-      </w:r>
-    </w:p>
-    <w:p>
-      <w:pPr>
-        <w:pStyle w:val="ListParagraph"/>
-        <w:numPr>
-          <w:ilvl w:val="0"/>
-          <w:numId w:val="2"/>
-        </w:numPr>
-        <w:spacing w:after="36" w:before="36"/>
-      </w:pPr>
-      <w:r>
-        <w:rPr>
-          <w:rFonts w:ascii="Arial" w:cs="Arial" w:eastAsia="Arial" w:hAnsi="Arial"/>
-          <w:sz w:val="20"/>
-          <w:szCs w:val="20"/>
-        </w:rPr>
-        <w:t xml:space="preserve">Assegnare una spesa “fuori periodo” a un periodo esistente allinea anche la sua sottocategoria (Weekend/Vacanze) al tipo reale del periodo scelto (vacationType()), non solo la competenza</w:t>
-      </w:r>
-    </w:p>
-    <w:p>
-      <w:pPr>
-        <w:pStyle w:val="ListParagraph"/>
-        <w:numPr>
-          <w:ilvl w:val="0"/>
-          <w:numId w:val="2"/>
-        </w:numPr>
-        <w:spacing w:after="36" w:before="36"/>
-      </w:pPr>
-      <w:r>
-        <w:rPr>
-          <w:rFonts w:ascii="Arial" w:cs="Arial" w:eastAsia="Arial" w:hAnsi="Arial"/>
-          <w:sz w:val="20"/>
-          <w:szCs w:val="20"/>
-        </w:rPr>
-        <w:t xml:space="preserve">Le stesse identiche informazioni/appPrefs (calendarVacations, calendarNotVacationDates, wv2ReviewDismissed, wv2NeverAiDescs) sono riproposte — filtrate alle sole transazioni appena importate — nel mega-step “🏖️ Vacanze” del Wizard di Import unificato (vedi 5.8): le decisioni prese in un punto restano sincronizzate nell’altro</w:t>
       </w:r>
     </w:p>
     <w:p>

</xml_diff>

<commit_message>
Docx: documenta nuovo campo Base risparmio manuale (mutuo)
</commit_message>
<xml_diff>
--- a/FamilyMoneyTracker_Instructions_v3.docx
+++ b/FamilyMoneyTracker_Instructions_v3.docx
@@ -12706,6 +12706,34 @@
           <w:szCs w:val="20"/>
         </w:rPr>
         <w:t xml:space="preserve">Estinzione manuale: click sulla cella Rata Mutuo in tabella apre popup per versare un extra one-off (stessa scadenza, rata ricalcolata)</w:t>
+      </w:r>
+    </w:p>
+    <w:p>
+      <w:pPr>
+        <w:pStyle w:val="ListParagraph"/>
+        <w:numPr>
+          <w:ilvl w:val="0"/>
+          <w:numId w:val="2"/>
+        </w:numPr>
+        <w:spacing w:after="36" w:before="36"/>
+      </w:pPr>
+      <w:r>
+        <w:rPr>
+          <w:rFonts w:ascii="Arial" w:cs="Arial" w:eastAsia="Arial" w:hAnsi="Arial"/>
+          <w:b/>
+          <w:bCs/>
+          <w:sz w:val="20"/>
+          <w:szCs w:val="20"/>
+        </w:rPr>
+        <w:t xml:space="preserve">Base risparmio (extraRepayBaseOverride, 2026-07-24): </w:t>
+      </w:r>
+      <w:r>
+        <w:rPr>
+          <w:rFonts w:ascii="Arial" w:cs="Arial" w:eastAsia="Arial" w:hAnsi="Arial"/>
+          <w:sz w:val="20"/>
+          <w:szCs w:val="20"/>
+        </w:rPr>
+        <w:t xml:space="preserve">campo manuale nel pannello Rimborso anticipato automatico — se impostato, sostituisce il saldo auto-catturato a inizio mutuo come base di riferimento per calcolare il surplus. Utile quando il mese/anno di inizio mutuo include grossi movimenti one-off (erogazione capitale, spesa d’acquisto) che renderebbero la base automatica troppo alta o troppo bassa da superare in tempi ragionevoli. Vuoto/0 = comportamento automatico (default)</w:t>
       </w:r>
     </w:p>
     <w:p>

</xml_diff>

<commit_message>
Docx v3: nuova sezione 4.6 Wizard Import Unificato (anteprima, doppioni prima del salvataggio, riepilogo editabile)
Co-Authored-By: Claude Opus 4.8 <noreply@anthropic.com>
</commit_message>
<xml_diff>
--- a/FamilyMoneyTracker_Instructions_v3.docx
+++ b/FamilyMoneyTracker_Instructions_v3.docx
@@ -4370,6 +4370,296 @@
     <w:p>
       <w:r>
         <w:br w:type="page"/>
+      </w:r>
+    </w:p>
+    <w:p>
+      <w:pPr>
+        <w:pStyle w:val="Heading2"/>
+        <w:spacing w:after="80" w:before="220"/>
+      </w:pPr>
+      <w:r>
+        <w:rPr>
+          <w:rFonts w:ascii="Arial" w:cs="Arial" w:eastAsia="Arial" w:hAnsi="Arial"/>
+          <w:b/>
+          <w:bCs/>
+          <w:color w:val="34495E"/>
+          <w:sz w:val="24"/>
+          <w:szCs w:val="24"/>
+        </w:rPr>
+        <w:t xml:space="preserve">4.6 Wizard Import Unificato (rev. 2026-09)</w:t>
+      </w:r>
+    </w:p>
+    <w:p>
+      <w:pPr>
+        <w:spacing w:after="60" w:before="60"/>
+      </w:pPr>
+      <w:r>
+        <w:rPr>
+          <w:rFonts w:ascii="Arial" w:cs="Arial" w:eastAsia="Arial" w:hAnsi="Arial"/>
+          <w:sz w:val="20"/>
+          <w:szCs w:val="20"/>
+        </w:rPr>
+        <w:t xml:space="preserve">Il modal a singola sorgente descritto in 4.1–4.5 e stato sostituito da un wizard unico (ImportWizard.jsx) che concatena conto, carte e PayPal in un solo flusso guidato, con rifinitura e compensazioni. La schermata iniziale e compatta: tre icone (Conto, Carte, PayPal), senza storico; alla selezione la cornice si allarga ed entra negli step. Ordine sorgenti: Conto -&gt; Carte -&gt; PayPal.</w:t>
+      </w:r>
+    </w:p>
+    <w:p>
+      <w:pPr>
+        <w:pStyle w:val="ListParagraph"/>
+        <w:numPr>
+          <w:ilvl w:val="0"/>
+          <w:numId w:val="2"/>
+        </w:numPr>
+        <w:spacing w:after="36" w:before="36"/>
+      </w:pPr>
+      <w:r>
+        <w:rPr>
+          <w:rFonts w:ascii="Arial" w:cs="Arial" w:eastAsia="Arial" w:hAnsi="Arial"/>
+          <w:b/>
+          <w:bCs/>
+          <w:sz w:val="20"/>
+          <w:szCs w:val="20"/>
+        </w:rPr>
+        <w:t xml:space="preserve">Principio doppioni: </w:t>
+      </w:r>
+      <w:r>
+        <w:rPr>
+          <w:rFonts w:ascii="Arial" w:cs="Arial" w:eastAsia="Arial" w:hAnsi="Arial"/>
+          <w:sz w:val="20"/>
+          <w:szCs w:val="20"/>
+        </w:rPr>
+        <w:t xml:space="preserve">un doppione richiede STESSO importo + STESSA data + STESSA descrizione rispetto al database (rimosso il vecchio confronto intra-batch). I doppioni si verificano SEMPRE contro il DB, mai contro le righe dello stesso import.</w:t>
+      </w:r>
+    </w:p>
+    <w:p>
+      <w:pPr>
+        <w:pStyle w:val="ListParagraph"/>
+        <w:numPr>
+          <w:ilvl w:val="0"/>
+          <w:numId w:val="2"/>
+        </w:numPr>
+        <w:spacing w:after="36" w:before="36"/>
+      </w:pPr>
+      <w:r>
+        <w:rPr>
+          <w:rFonts w:ascii="Arial" w:cs="Arial" w:eastAsia="Arial" w:hAnsi="Arial"/>
+          <w:b/>
+          <w:bCs/>
+          <w:sz w:val="20"/>
+          <w:szCs w:val="20"/>
+        </w:rPr>
+        <w:t xml:space="preserve">Conto (orchestrato dal wizard): </w:t>
+      </w:r>
+      <w:r>
+        <w:rPr>
+          <w:rFonts w:ascii="Arial" w:cs="Arial" w:eastAsia="Arial" w:hAnsi="Arial"/>
+          <w:sz w:val="20"/>
+          <w:szCs w:val="20"/>
+        </w:rPr>
+        <w:t xml:space="preserve">Import (parse, NON salva) -&gt; Anteprima/selezione (checkbox, di default tutte) -&gt; Doppioni (su righe ANCORA NON salvate) -&gt; salvataggio + AI + regole solo sulle righe superstiti. ImportModal riceve la prop onParsed e consegna le righe parsate al wizard; salvataggio/AI/regole sono estratti in src/data/importCommit.js (commitParsedTxs), invocato dopo i doppioni.</w:t>
+      </w:r>
+    </w:p>
+    <w:p>
+      <w:pPr>
+        <w:pStyle w:val="ListParagraph"/>
+        <w:numPr>
+          <w:ilvl w:val="0"/>
+          <w:numId w:val="2"/>
+        </w:numPr>
+        <w:spacing w:after="36" w:before="36"/>
+      </w:pPr>
+      <w:r>
+        <w:rPr>
+          <w:rFonts w:ascii="Arial" w:cs="Arial" w:eastAsia="Arial" w:hAnsi="Arial"/>
+          <w:b/>
+          <w:bCs/>
+          <w:sz w:val="20"/>
+          <w:szCs w:val="20"/>
+        </w:rPr>
+        <w:t xml:space="preserve">Carte (interno a ImportModal): </w:t>
+      </w:r>
+      <w:r>
+        <w:rPr>
+          <w:rFonts w:ascii="Arial" w:cs="Arial" w:eastAsia="Arial" w:hAnsi="Arial"/>
+          <w:sz w:val="20"/>
+          <w:szCs w:val="20"/>
+        </w:rPr>
+        <w:t xml:space="preserve">Import -&gt; Anteprima -&gt; Riconciliazione mensile (estratti) -&gt; Doppioni PRIMA del salvataggio -&gt; cardFinalCommit (salva i superstiti + esclude gli estratti + verifica saldo invariato con rollback automatico + AI). La rettifica di saldo per-mese e RICALCOLATA sui superstiti dopo i doppioni, cosi il saldo resta invariato anche se si eliminano righe. handleCardReconcileConfirm e diviso in prepare (nel wizard non salva, passa ai doppioni) + cardFinalCommit. Lo standalone (fuori dal wizard) salva subito come prima.</w:t>
+      </w:r>
+    </w:p>
+    <w:p>
+      <w:pPr>
+        <w:pStyle w:val="ListParagraph"/>
+        <w:numPr>
+          <w:ilvl w:val="0"/>
+          <w:numId w:val="2"/>
+        </w:numPr>
+        <w:spacing w:after="36" w:before="36"/>
+      </w:pPr>
+      <w:r>
+        <w:rPr>
+          <w:rFonts w:ascii="Arial" w:cs="Arial" w:eastAsia="Arial" w:hAnsi="Arial"/>
+          <w:b/>
+          <w:bCs/>
+          <w:sz w:val="20"/>
+          <w:szCs w:val="20"/>
+        </w:rPr>
+        <w:t xml:space="preserve">PayPal: </w:t>
+      </w:r>
+      <w:r>
+        <w:rPr>
+          <w:rFonts w:ascii="Arial" w:cs="Arial" w:eastAsia="Arial" w:hAnsi="Arial"/>
+          <w:sz w:val="20"/>
+          <w:szCs w:val="20"/>
+        </w:rPr>
+        <w:t xml:space="preserve">invariato rispetto alla sezione 5 (screenshot/PDF -&gt; abbinamento automatico), integrato come ultimo blocco del wizard.</w:t>
+      </w:r>
+    </w:p>
+    <w:p>
+      <w:pPr>
+        <w:pStyle w:val="ListParagraph"/>
+        <w:numPr>
+          <w:ilvl w:val="0"/>
+          <w:numId w:val="2"/>
+        </w:numPr>
+        <w:spacing w:after="36" w:before="36"/>
+      </w:pPr>
+      <w:r>
+        <w:rPr>
+          <w:rFonts w:ascii="Arial" w:cs="Arial" w:eastAsia="Arial" w:hAnsi="Arial"/>
+          <w:b/>
+          <w:bCs/>
+          <w:sz w:val="20"/>
+          <w:szCs w:val="20"/>
+        </w:rPr>
+        <w:t xml:space="preserve">DoppioniStep: </w:t>
+      </w:r>
+      <w:r>
+        <w:rPr>
+          <w:rFonts w:ascii="Arial" w:cs="Arial" w:eastAsia="Arial" w:hAnsi="Arial"/>
+          <w:sz w:val="20"/>
+          <w:szCs w:val="20"/>
+        </w:rPr>
+        <w:t xml:space="preserve">componente definito in ImportWizard.jsx, ESPORTATO e riusato dentro ImportModal (import circolare risolto per hoisting). Modalita 'unsaved' con callback onCommit. Vista a due colonne: a sinistra la riga gia nel DB, a destra la riga in arrivo dal CSV.</w:t>
+      </w:r>
+    </w:p>
+    <w:p>
+      <w:pPr>
+        <w:pStyle w:val="ListParagraph"/>
+        <w:numPr>
+          <w:ilvl w:val="0"/>
+          <w:numId w:val="2"/>
+        </w:numPr>
+        <w:spacing w:after="36" w:before="36"/>
+      </w:pPr>
+      <w:r>
+        <w:rPr>
+          <w:rFonts w:ascii="Arial" w:cs="Arial" w:eastAsia="Arial" w:hAnsi="Arial"/>
+          <w:b/>
+          <w:bCs/>
+          <w:sz w:val="20"/>
+          <w:szCs w:val="20"/>
+        </w:rPr>
+        <w:t xml:space="preserve">Controllo saldo (solo conto, opzionale): </w:t>
+      </w:r>
+      <w:r>
+        <w:rPr>
+          <w:rFonts w:ascii="Arial" w:cs="Arial" w:eastAsia="Arial" w:hAnsi="Arial"/>
+          <w:sz w:val="20"/>
+          <w:szCs w:val="20"/>
+        </w:rPr>
+        <w:t xml:space="preserve">inserendo il 'nuovo saldo da banca' lo step Doppioni mostra il gap (Saldo post import - nuovo saldo) e non fa proseguire finche non e azzerato. Gli input saldo accettano il formato italiano con la virgola (parseDecimalIT in src/utils/format.js).</w:t>
+      </w:r>
+    </w:p>
+    <w:p>
+      <w:pPr>
+        <w:pStyle w:val="ListParagraph"/>
+        <w:numPr>
+          <w:ilvl w:val="0"/>
+          <w:numId w:val="2"/>
+        </w:numPr>
+        <w:spacing w:after="36" w:before="36"/>
+      </w:pPr>
+      <w:r>
+        <w:rPr>
+          <w:rFonts w:ascii="Arial" w:cs="Arial" w:eastAsia="Arial" w:hAnsi="Arial"/>
+          <w:b/>
+          <w:bCs/>
+          <w:sz w:val="20"/>
+          <w:szCs w:val="20"/>
+        </w:rPr>
+        <w:t xml:space="preserve">Step comuni finali: </w:t>
+      </w:r>
+      <w:r>
+        <w:rPr>
+          <w:rFonts w:ascii="Arial" w:cs="Arial" w:eastAsia="Arial" w:hAnsi="Arial"/>
+          <w:sz w:val="20"/>
+          <w:szCs w:val="20"/>
+        </w:rPr>
+        <w:t xml:space="preserve">una volta sola e limitati alle sole transazioni di questo import (importedIdSet): Compensazioni -&gt; Vacanze -&gt; Documenti/Ricevute (se presenti) -&gt; Riepilogo Transazioni EDITABILE (RefineTable: categoria L1, sottocategoria L2, descrizione e citta modificabili inline, pulsante 'Conferma tutto') -&gt; Riepilogo KPI.</w:t>
+      </w:r>
+    </w:p>
+    <w:p>
+      <w:pPr>
+        <w:pStyle w:val="ListParagraph"/>
+        <w:numPr>
+          <w:ilvl w:val="0"/>
+          <w:numId w:val="2"/>
+        </w:numPr>
+        <w:spacing w:after="36" w:before="36"/>
+      </w:pPr>
+      <w:r>
+        <w:rPr>
+          <w:rFonts w:ascii="Arial" w:cs="Arial" w:eastAsia="Arial" w:hAnsi="Arial"/>
+          <w:b/>
+          <w:bCs/>
+          <w:sz w:val="20"/>
+          <w:szCs w:val="20"/>
+        </w:rPr>
+        <w:t xml:space="preserve">Categorie: </w:t>
+      </w:r>
+      <w:r>
+        <w:rPr>
+          <w:rFonts w:ascii="Arial" w:cs="Arial" w:eastAsia="Arial" w:hAnsi="Arial"/>
+          <w:sz w:val="20"/>
+          <w:szCs w:val="20"/>
+        </w:rPr>
+        <w:t xml:space="preserve">modello a DUE livelli (L1 = cat1, L2 = cat2/sub in src/data/categories.js). Non esiste un terzo livello L3.</w:t>
+      </w:r>
+    </w:p>
+    <w:p>
+      <w:pPr>
+        <w:pStyle w:val="ListParagraph"/>
+        <w:numPr>
+          <w:ilvl w:val="0"/>
+          <w:numId w:val="2"/>
+        </w:numPr>
+        <w:spacing w:after="36" w:before="36"/>
+      </w:pPr>
+      <w:r>
+        <w:rPr>
+          <w:rFonts w:ascii="Arial" w:cs="Arial" w:eastAsia="Arial" w:hAnsi="Arial"/>
+          <w:b/>
+          <w:bCs/>
+          <w:sz w:val="20"/>
+          <w:szCs w:val="20"/>
+        </w:rPr>
+        <w:t xml:space="preserve">Undo: </w:t>
+      </w:r>
+      <w:r>
+        <w:rPr>
+          <w:rFonts w:ascii="Arial" w:cs="Arial" w:eastAsia="Arial" w:hAnsi="Arial"/>
+          <w:sz w:val="20"/>
+          <w:szCs w:val="20"/>
+        </w:rPr>
+        <w:t xml:space="preserve">ogni import e un'unica voce nello stack (beginTxUndoBatch/commitTxUndoBatch); chiudere il wizard a meta annulla per intero l'import della sessione. Nulla viene salvato prima dei doppioni.</w:t>
+      </w:r>
+    </w:p>
+    <w:p>
+      <w:pPr>
+        <w:spacing w:after="60" w:before="60"/>
+      </w:pPr>
+      <w:r>
+        <w:t xml:space="preserve"/>
       </w:r>
     </w:p>
     <w:p>

</xml_diff>

<commit_message>
Docx v3: riscritto capitolo 4 Import (Wizard Unificato) - 4.1-4.5 aggiornate al flusso attuale (anteprima, doppioni prima del salvataggio, riepilogo editabile); rimosse le sezioni obsolete del vecchio modal
Co-Authored-By: Claude Opus 4.8 <noreply@anthropic.com>
</commit_message>
<xml_diff>
--- a/FamilyMoneyTracker_Instructions_v3.docx
+++ b/FamilyMoneyTracker_Instructions_v3.docx
@@ -3907,7 +3907,7 @@
           <w:sz w:val="28"/>
           <w:szCs w:val="28"/>
         </w:rPr>
-        <w:t xml:space="preserve">4. Import CSV</w:t>
+        <w:t xml:space="preserve">4. Import — Wizard Unificato</w:t>
       </w:r>
     </w:p>
     <w:p>
@@ -3920,7 +3920,7 @@
           <w:sz w:val="20"/>
           <w:szCs w:val="20"/>
         </w:rPr>
-        <w:t xml:space="preserve">Il punto di import CSV è la sezione Transazioni. Il modal ha un selettore esplicito "Conto Corrente" / "Carta di Credito". Supporta multi-file: più CSV possono essere caricati in un singolo import.</w:t>
+        <w:t xml:space="preserve">L'import e un wizard unico (ImportWizard.jsx) che concatena conto, carte e PayPal in un solo flusso guidato con rifinitura e compensazioni. Punto di accesso dalla sezione Transazioni. La schermata iniziale e compatta (tre icone: Conto, Carte, PayPal, senza storico); selezionando le sorgenti la cornice si allarga ed entra negli step. Ordine: Conto -&gt; Carte -&gt; PayPal. Supporta multi-file e file Excel (.xls/.xlsx) oltre al CSV.</w:t>
       </w:r>
     </w:p>
     <w:p>
@@ -3945,7 +3945,7 @@
           <w:sz w:val="24"/>
           <w:szCs w:val="24"/>
         </w:rPr>
-        <w:t xml:space="preserve">4.1 Tipi di CSV supportati</w:t>
+        <w:t xml:space="preserve">4.1 Tipi di file supportati</w:t>
       </w:r>
     </w:p>
     <w:p>
@@ -3960,10 +3960,20 @@
       <w:r>
         <w:rPr>
           <w:rFonts w:ascii="Arial" w:cs="Arial" w:eastAsia="Arial" w:hAnsi="Arial"/>
-          <w:sz w:val="20"/>
-          <w:szCs w:val="20"/>
-        </w:rPr>
-        <w:t xml:space="preserve">CSV Conto Corrente: movimenti del conto principale (Intesa Sanpaolo, Fineco, ecc.) — contiene l'addebito totale mensile carta</w:t>
+          <w:b/>
+          <w:bCs/>
+          <w:sz w:val="20"/>
+          <w:szCs w:val="20"/>
+        </w:rPr>
+        <w:t xml:space="preserve">Conto corrente: </w:t>
+      </w:r>
+      <w:r>
+        <w:rPr>
+          <w:rFonts w:ascii="Arial" w:cs="Arial" w:eastAsia="Arial" w:hAnsi="Arial"/>
+          <w:sz w:val="20"/>
+          <w:szCs w:val="20"/>
+        </w:rPr>
+        <w:t xml:space="preserve">CSV/Excel dei movimenti (UniCredit, Fineco, BNL, Banco BPM, BPER, Credem, Widiba e altri formati italiani); il parser rileva il formato automaticamente.</w:t>
       </w:r>
     </w:p>
     <w:p>
@@ -3978,35 +3988,20 @@
       <w:r>
         <w:rPr>
           <w:rFonts w:ascii="Arial" w:cs="Arial" w:eastAsia="Arial" w:hAnsi="Arial"/>
-          <w:sz w:val="20"/>
-          <w:szCs w:val="20"/>
-        </w:rPr>
-        <w:t xml:space="preserve">CSV Carta di Credito: estratto conto carta (Amex, Visa, ecc.) — contiene le singole transazioni</w:t>
-      </w:r>
-    </w:p>
-    <w:p>
-      <w:pPr>
-        <w:spacing w:after="60" w:before="60"/>
-      </w:pPr>
-      <w:r>
-        <w:t xml:space="preserve"/>
-      </w:r>
-    </w:p>
-    <w:p>
-      <w:pPr>
-        <w:pStyle w:val="Heading2"/>
-        <w:spacing w:after="80" w:before="220"/>
-      </w:pPr>
-      <w:r>
-        <w:rPr>
-          <w:rFonts w:ascii="Arial" w:cs="Arial" w:eastAsia="Arial" w:hAnsi="Arial"/>
           <w:b/>
           <w:bCs/>
-          <w:color w:val="34495E"/>
-          <w:sz w:val="24"/>
-          <w:szCs w:val="24"/>
-        </w:rPr>
-        <w:t xml:space="preserve">4.2 Pipeline import</w:t>
+          <w:sz w:val="20"/>
+          <w:szCs w:val="20"/>
+        </w:rPr>
+        <w:t xml:space="preserve">Carte di credito: </w:t>
+      </w:r>
+      <w:r>
+        <w:rPr>
+          <w:rFonts w:ascii="Arial" w:cs="Arial" w:eastAsia="Arial" w:hAnsi="Arial"/>
+          <w:sz w:val="20"/>
+          <w:szCs w:val="20"/>
+        </w:rPr>
+        <w:t xml:space="preserve">CSV/Excel dell'estratto carta, con riconciliazione mensile verso l'addebito sul conto corrente.</w:t>
       </w:r>
     </w:p>
     <w:p>
@@ -4021,10 +4016,20 @@
       <w:r>
         <w:rPr>
           <w:rFonts w:ascii="Arial" w:cs="Arial" w:eastAsia="Arial" w:hAnsi="Arial"/>
-          <w:sz w:val="20"/>
-          <w:szCs w:val="20"/>
-        </w:rPr>
-        <w:t xml:space="preserve">Step 1 — Parsing: il CSV viene letto, normalizzato (encoding, separatori, date)</w:t>
+          <w:b/>
+          <w:bCs/>
+          <w:sz w:val="20"/>
+          <w:szCs w:val="20"/>
+        </w:rPr>
+        <w:t xml:space="preserve">PayPal: </w:t>
+      </w:r>
+      <w:r>
+        <w:rPr>
+          <w:rFonts w:ascii="Arial" w:cs="Arial" w:eastAsia="Arial" w:hAnsi="Arial"/>
+          <w:sz w:val="20"/>
+          <w:szCs w:val="20"/>
+        </w:rPr>
+        <w:t xml:space="preserve">screenshot o PDF (vedi sezione 5).</w:t>
       </w:r>
     </w:p>
     <w:p>
@@ -4039,10 +4044,45 @@
       <w:r>
         <w:rPr>
           <w:rFonts w:ascii="Arial" w:cs="Arial" w:eastAsia="Arial" w:hAnsi="Arial"/>
-          <w:sz w:val="20"/>
-          <w:szCs w:val="20"/>
-        </w:rPr>
-        <w:t xml:space="preserve">Step 2 — Deduplicazione: chiave = data + importo + descrizione normalizzata. Duplicati scartati silenziosamente e conteggiati nel log</w:t>
+          <w:b/>
+          <w:bCs/>
+          <w:sz w:val="20"/>
+          <w:szCs w:val="20"/>
+        </w:rPr>
+        <w:t xml:space="preserve">Multi-file: </w:t>
+      </w:r>
+      <w:r>
+        <w:rPr>
+          <w:rFonts w:ascii="Arial" w:cs="Arial" w:eastAsia="Arial" w:hAnsi="Arial"/>
+          <w:sz w:val="20"/>
+          <w:szCs w:val="20"/>
+        </w:rPr>
+        <w:t xml:space="preserve">piu file nello stesso import; le righe di riepilogo/totale mensile presenti nel file vengono scartate automaticamente.</w:t>
+      </w:r>
+    </w:p>
+    <w:p>
+      <w:pPr>
+        <w:spacing w:after="60" w:before="60"/>
+      </w:pPr>
+      <w:r>
+        <w:t xml:space="preserve"/>
+      </w:r>
+    </w:p>
+    <w:p>
+      <w:pPr>
+        <w:pStyle w:val="Heading2"/>
+        <w:spacing w:after="80" w:before="220"/>
+      </w:pPr>
+      <w:r>
+        <w:rPr>
+          <w:rFonts w:ascii="Arial" w:cs="Arial" w:eastAsia="Arial" w:hAnsi="Arial"/>
+          <w:b/>
+          <w:bCs/>
+          <w:color w:val="34495E"/>
+          <w:sz w:val="24"/>
+          <w:szCs w:val="24"/>
+        </w:rPr>
+        <w:t xml:space="preserve">4.2 Flusso Conto</w:t>
       </w:r>
     </w:p>
     <w:p>
@@ -4057,10 +4097,20 @@
       <w:r>
         <w:rPr>
           <w:rFonts w:ascii="Arial" w:cs="Arial" w:eastAsia="Arial" w:hAnsi="Arial"/>
-          <w:sz w:val="20"/>
-          <w:szCs w:val="20"/>
-        </w:rPr>
-        <w:t xml:space="preserve">Step 3 — Arricchimento: per ogni nuova transazione viene generato un txId (formato "YY-NNNN"), assegnato account e type</w:t>
+          <w:b/>
+          <w:bCs/>
+          <w:sz w:val="20"/>
+          <w:szCs w:val="20"/>
+        </w:rPr>
+        <w:t xml:space="preserve">Import: </w:t>
+      </w:r>
+      <w:r>
+        <w:rPr>
+          <w:rFonts w:ascii="Arial" w:cs="Arial" w:eastAsia="Arial" w:hAnsi="Arial"/>
+          <w:sz w:val="20"/>
+          <w:szCs w:val="20"/>
+        </w:rPr>
+        <w:t xml:space="preserve">il file viene solo parsato, NESSUN salvataggio. ImportModal riceve la prop onParsed e consegna le righe al wizard.</w:t>
       </w:r>
     </w:p>
     <w:p>
@@ -4075,10 +4125,20 @@
       <w:r>
         <w:rPr>
           <w:rFonts w:ascii="Arial" w:cs="Arial" w:eastAsia="Arial" w:hAnsi="Arial"/>
-          <w:sz w:val="20"/>
-          <w:szCs w:val="20"/>
-        </w:rPr>
-        <w:t xml:space="preserve">Step 4 — AI categorizzazione: applyAiRules(description, amount, date) su ogni transazione nuova — assegna cat1, cat2, descAI</w:t>
+          <w:b/>
+          <w:bCs/>
+          <w:sz w:val="20"/>
+          <w:szCs w:val="20"/>
+        </w:rPr>
+        <w:t xml:space="preserve">Anteprima/selezione: </w:t>
+      </w:r>
+      <w:r>
+        <w:rPr>
+          <w:rFonts w:ascii="Arial" w:cs="Arial" w:eastAsia="Arial" w:hAnsi="Arial"/>
+          <w:sz w:val="20"/>
+          <w:szCs w:val="20"/>
+        </w:rPr>
+        <w:t xml:space="preserve">tabella con checkbox, di default tutte selezionate; le righe deselezionate non vengono importate.</w:t>
       </w:r>
     </w:p>
     <w:p>
@@ -4093,10 +4153,20 @@
       <w:r>
         <w:rPr>
           <w:rFonts w:ascii="Arial" w:cs="Arial" w:eastAsia="Arial" w:hAnsi="Arial"/>
-          <w:sz w:val="20"/>
-          <w:szCs w:val="20"/>
-        </w:rPr>
-        <w:t xml:space="preserve">Step 5 — Riconciliazione carta (solo se tipo=carta): cerca ed esclude l'addebito totale sul conto corrente</w:t>
+          <w:b/>
+          <w:bCs/>
+          <w:sz w:val="20"/>
+          <w:szCs w:val="20"/>
+        </w:rPr>
+        <w:t xml:space="preserve">Doppioni: </w:t>
+      </w:r>
+      <w:r>
+        <w:rPr>
+          <w:rFonts w:ascii="Arial" w:cs="Arial" w:eastAsia="Arial" w:hAnsi="Arial"/>
+          <w:sz w:val="20"/>
+          <w:szCs w:val="20"/>
+        </w:rPr>
+        <w:t xml:space="preserve">verifica sulle righe ANCORA NON salvate, sempre contro il DB (vedi 4.4).</w:t>
       </w:r>
     </w:p>
     <w:p>
@@ -4111,35 +4181,20 @@
       <w:r>
         <w:rPr>
           <w:rFonts w:ascii="Arial" w:cs="Arial" w:eastAsia="Arial" w:hAnsi="Arial"/>
-          <w:sz w:val="20"/>
-          <w:szCs w:val="20"/>
-        </w:rPr>
-        <w:t xml:space="preserve">Step 6 — Salvataggio: batchSaveDocuments() su Firestore, aggiornamento store Zustand</w:t>
-      </w:r>
-    </w:p>
-    <w:p>
-      <w:pPr>
-        <w:spacing w:after="60" w:before="60"/>
-      </w:pPr>
-      <w:r>
-        <w:t xml:space="preserve"/>
-      </w:r>
-    </w:p>
-    <w:p>
-      <w:pPr>
-        <w:pStyle w:val="Heading2"/>
-        <w:spacing w:after="80" w:before="220"/>
-      </w:pPr>
-      <w:r>
-        <w:rPr>
-          <w:rFonts w:ascii="Arial" w:cs="Arial" w:eastAsia="Arial" w:hAnsi="Arial"/>
           <w:b/>
           <w:bCs/>
-          <w:color w:val="34495E"/>
-          <w:sz w:val="24"/>
-          <w:szCs w:val="24"/>
-        </w:rPr>
-        <w:t xml:space="preserve">4.3 Riconciliazione Carta di Credito</w:t>
+          <w:sz w:val="20"/>
+          <w:szCs w:val="20"/>
+        </w:rPr>
+        <w:t xml:space="preserve">Salvataggio + AI + regole: </w:t>
+      </w:r>
+      <w:r>
+        <w:rPr>
+          <w:rFonts w:ascii="Arial" w:cs="Arial" w:eastAsia="Arial" w:hAnsi="Arial"/>
+          <w:sz w:val="20"/>
+          <w:szCs w:val="20"/>
+        </w:rPr>
+        <w:t xml:space="preserve">solo sulle righe superstiti, tramite src/data/importCommit.js (commitParsedTxs = saveTxs + enrichment Gemini + regole). L'AI gira solo su cio che resta: nessun token sprecato su doppioni o righe escluse.</w:t>
       </w:r>
     </w:p>
     <w:p>
@@ -4154,10 +4209,45 @@
       <w:r>
         <w:rPr>
           <w:rFonts w:ascii="Arial" w:cs="Arial" w:eastAsia="Arial" w:hAnsi="Arial"/>
-          <w:sz w:val="20"/>
-          <w:szCs w:val="20"/>
-        </w:rPr>
-        <w:t xml:space="preserve">Logica: cerca nel conto corrente una transazione con importo uguale alla somma delle transazioni carta ± tolleranza</w:t>
+          <w:b/>
+          <w:bCs/>
+          <w:sz w:val="20"/>
+          <w:szCs w:val="20"/>
+        </w:rPr>
+        <w:t xml:space="preserve">Controllo saldo (opzionale): </w:t>
+      </w:r>
+      <w:r>
+        <w:rPr>
+          <w:rFonts w:ascii="Arial" w:cs="Arial" w:eastAsia="Arial" w:hAnsi="Arial"/>
+          <w:sz w:val="20"/>
+          <w:szCs w:val="20"/>
+        </w:rPr>
+        <w:t xml:space="preserve">inserendo il 'nuovo saldo da banca' lo step Doppioni mostra il gap (Saldo post import - nuovo saldo) e non fa proseguire finche non e azzerato; input in formato italiano con la virgola (parseDecimalIT in src/utils/format.js). Se il gap non e spiegabile coi doppioni si puo creare una rettifica ('tappo') protetta da PIN.</w:t>
+      </w:r>
+    </w:p>
+    <w:p>
+      <w:pPr>
+        <w:spacing w:after="60" w:before="60"/>
+      </w:pPr>
+      <w:r>
+        <w:t xml:space="preserve"/>
+      </w:r>
+    </w:p>
+    <w:p>
+      <w:pPr>
+        <w:pStyle w:val="Heading2"/>
+        <w:spacing w:after="80" w:before="220"/>
+      </w:pPr>
+      <w:r>
+        <w:rPr>
+          <w:rFonts w:ascii="Arial" w:cs="Arial" w:eastAsia="Arial" w:hAnsi="Arial"/>
+          <w:b/>
+          <w:bCs/>
+          <w:color w:val="34495E"/>
+          <w:sz w:val="24"/>
+          <w:szCs w:val="24"/>
+        </w:rPr>
+        <w:t xml:space="preserve">4.3 Flusso Carte</w:t>
       </w:r>
     </w:p>
     <w:p>
@@ -4172,10 +4262,20 @@
       <w:r>
         <w:rPr>
           <w:rFonts w:ascii="Arial" w:cs="Arial" w:eastAsia="Arial" w:hAnsi="Arial"/>
-          <w:sz w:val="20"/>
-          <w:szCs w:val="20"/>
-        </w:rPr>
-        <w:t xml:space="preserve">Match trovato: quella transazione viene marcata excluded=true con excludeReason="addebito carta" → banner verde "✓ Carta riconciliata"</w:t>
+          <w:b/>
+          <w:bCs/>
+          <w:sz w:val="20"/>
+          <w:szCs w:val="20"/>
+        </w:rPr>
+        <w:t xml:space="preserve">Ordine: </w:t>
+      </w:r>
+      <w:r>
+        <w:rPr>
+          <w:rFonts w:ascii="Arial" w:cs="Arial" w:eastAsia="Arial" w:hAnsi="Arial"/>
+          <w:sz w:val="20"/>
+          <w:szCs w:val="20"/>
+        </w:rPr>
+        <w:t xml:space="preserve">Import -&gt; Anteprima/selezione -&gt; Riconciliazione mensile -&gt; Doppioni PRIMA del salvataggio -&gt; commit finale. Anteprima, riconciliazione e doppioni sono fasi interne a ImportModal.</w:t>
       </w:r>
     </w:p>
     <w:p>
@@ -4190,10 +4290,20 @@
       <w:r>
         <w:rPr>
           <w:rFonts w:ascii="Arial" w:cs="Arial" w:eastAsia="Arial" w:hAnsi="Arial"/>
-          <w:sz w:val="20"/>
-          <w:szCs w:val="20"/>
-        </w:rPr>
-        <w:t xml:space="preserve">Match non trovato: banner giallo "⚠ Mancano €X — verifica i file caricati" (non bloccante)</w:t>
+          <w:b/>
+          <w:bCs/>
+          <w:sz w:val="20"/>
+          <w:szCs w:val="20"/>
+        </w:rPr>
+        <w:t xml:space="preserve">Riconciliazione mensile: </w:t>
+      </w:r>
+      <w:r>
+        <w:rPr>
+          <w:rFonts w:ascii="Arial" w:cs="Arial" w:eastAsia="Arial" w:hAnsi="Arial"/>
+          <w:sz w:val="20"/>
+          <w:szCs w:val="20"/>
+        </w:rPr>
+        <w:t xml:space="preserve">per ogni mese il totale del dettaglio carta viene abbinato all'addebito (estratto) sul conto; l'estratto abbinato viene escluso (excluded=true) e sostituito dal dettaglio. I mesi senza estratto disponibile restano fuori e si reimportano piu avanti.</w:t>
       </w:r>
     </w:p>
     <w:p>
@@ -4208,73 +4318,20 @@
       <w:r>
         <w:rPr>
           <w:rFonts w:ascii="Arial" w:cs="Arial" w:eastAsia="Arial" w:hAnsi="Arial"/>
-          <w:sz w:val="20"/>
-          <w:szCs w:val="20"/>
-        </w:rPr>
-        <w:t xml:space="preserve">Il banner mostra sempre il delta tra somma carta e importo addebito trovato</w:t>
-      </w:r>
-    </w:p>
-    <w:p>
-      <w:pPr>
-        <w:spacing w:after="60" w:before="60"/>
-      </w:pPr>
-      <w:r>
-        <w:t xml:space="preserve"/>
-      </w:r>
-    </w:p>
-    <w:p>
-      <w:pPr>
-        <w:pStyle w:val="Heading2"/>
-        <w:spacing w:after="80" w:before="220"/>
-      </w:pPr>
-      <w:r>
-        <w:rPr>
-          <w:rFonts w:ascii="Arial" w:cs="Arial" w:eastAsia="Arial" w:hAnsi="Arial"/>
           <w:b/>
           <w:bCs/>
-          <w:color w:val="34495E"/>
-          <w:sz w:val="24"/>
-          <w:szCs w:val="24"/>
-        </w:rPr>
-        <w:t xml:space="preserve">4.4 Log import</w:t>
-      </w:r>
-    </w:p>
-    <w:p>
-      <w:pPr>
-        <w:spacing w:after="60" w:before="60"/>
-      </w:pPr>
-      <w:r>
-        <w:rPr>
-          <w:rFonts w:ascii="Arial" w:cs="Arial" w:eastAsia="Arial" w:hAnsi="Arial"/>
-          <w:sz w:val="20"/>
-          <w:szCs w:val="20"/>
-        </w:rPr>
-        <w:t xml:space="preserve">Ogni import produce un record log contenente: data/ora, nome file, tipo (conto|carta), N transazioni nuove, N duplicate, stato riconciliazione carta (ok|warning|n/a), importo delta se warning.</w:t>
-      </w:r>
-    </w:p>
-    <w:p>
-      <w:pPr>
-        <w:spacing w:after="60" w:before="60"/>
-      </w:pPr>
-      <w:r>
-        <w:t xml:space="preserve"/>
-      </w:r>
-    </w:p>
-    <w:p>
-      <w:pPr>
-        <w:pStyle w:val="Heading2"/>
-        <w:spacing w:after="80" w:before="220"/>
-      </w:pPr>
-      <w:r>
-        <w:rPr>
-          <w:rFonts w:ascii="Arial" w:cs="Arial" w:eastAsia="Arial" w:hAnsi="Arial"/>
-          <w:b/>
-          <w:bCs/>
-          <w:color w:val="34495E"/>
-          <w:sz w:val="24"/>
-          <w:szCs w:val="24"/>
-        </w:rPr>
-        <w:t xml:space="preserve">4.5 Categorizzazione AI all'import</w:t>
+          <w:sz w:val="20"/>
+          <w:szCs w:val="20"/>
+        </w:rPr>
+        <w:t xml:space="preserve">Garanzia saldo invariato: </w:t>
+      </w:r>
+      <w:r>
+        <w:rPr>
+          <w:rFonts w:ascii="Arial" w:cs="Arial" w:eastAsia="Arial" w:hAnsi="Arial"/>
+          <w:sz w:val="20"/>
+          <w:szCs w:val="20"/>
+        </w:rPr>
+        <w:t xml:space="preserve">una rettifica automatica copre l'eventuale differenza estratto/dettaglio (arrotondamenti, commissioni), RICALCOLATA sui superstiti dopo i doppioni. Un check finale confronta il saldo prima/dopo: se cambia anche di un centesimo, rollback automatico e messaggio d'errore, senza dati corrotti ne token AI spesi.</w:t>
       </w:r>
     </w:p>
     <w:p>
@@ -4289,10 +4346,45 @@
       <w:r>
         <w:rPr>
           <w:rFonts w:ascii="Arial" w:cs="Arial" w:eastAsia="Arial" w:hAnsi="Arial"/>
-          <w:sz w:val="20"/>
-          <w:szCs w:val="20"/>
-        </w:rPr>
-        <w:t xml:space="preserve">applyAiRules(description, amount, date) è l'entry point per la categorizzazione automatica</w:t>
+          <w:b/>
+          <w:bCs/>
+          <w:sz w:val="20"/>
+          <w:szCs w:val="20"/>
+        </w:rPr>
+        <w:t xml:space="preserve">cardFinalCommit: </w:t>
+      </w:r>
+      <w:r>
+        <w:rPr>
+          <w:rFonts w:ascii="Arial" w:cs="Arial" w:eastAsia="Arial" w:hAnsi="Arial"/>
+          <w:sz w:val="20"/>
+          <w:szCs w:val="20"/>
+        </w:rPr>
+        <w:t xml:space="preserve">salva superstiti + rettifiche -&gt; esclude estratti -&gt; verifica saldo -&gt; AI -&gt; regole. handleCardReconcileConfirm e diviso in prepare (nel wizard non salva, passa ai doppioni) + cardFinalCommit. Lo standalone (fuori dal wizard) salva subito come in passato.</w:t>
+      </w:r>
+    </w:p>
+    <w:p>
+      <w:pPr>
+        <w:spacing w:after="60" w:before="60"/>
+      </w:pPr>
+      <w:r>
+        <w:t xml:space="preserve"/>
+      </w:r>
+    </w:p>
+    <w:p>
+      <w:pPr>
+        <w:pStyle w:val="Heading2"/>
+        <w:spacing w:after="80" w:before="220"/>
+      </w:pPr>
+      <w:r>
+        <w:rPr>
+          <w:rFonts w:ascii="Arial" w:cs="Arial" w:eastAsia="Arial" w:hAnsi="Arial"/>
+          <w:b/>
+          <w:bCs/>
+          <w:color w:val="34495E"/>
+          <w:sz w:val="24"/>
+          <w:szCs w:val="24"/>
+        </w:rPr>
+        <w:t xml:space="preserve">4.4 Doppioni</w:t>
       </w:r>
     </w:p>
     <w:p>
@@ -4307,10 +4399,20 @@
       <w:r>
         <w:rPr>
           <w:rFonts w:ascii="Arial" w:cs="Arial" w:eastAsia="Arial" w:hAnsi="Arial"/>
-          <w:sz w:val="20"/>
-          <w:szCs w:val="20"/>
-        </w:rPr>
-        <w:t xml:space="preserve">Controlla in ordine: 1) Regole King (isKing:true) → 2) Regole multi-condizione Firestore → 3) Regole semplici testuali → 4) Regole di sistema (hardcoded)</w:t>
+          <w:b/>
+          <w:bCs/>
+          <w:sz w:val="20"/>
+          <w:szCs w:val="20"/>
+        </w:rPr>
+        <w:t xml:space="preserve">Criterio: </w:t>
+      </w:r>
+      <w:r>
+        <w:rPr>
+          <w:rFonts w:ascii="Arial" w:cs="Arial" w:eastAsia="Arial" w:hAnsi="Arial"/>
+          <w:sz w:val="20"/>
+          <w:szCs w:val="20"/>
+        </w:rPr>
+        <w:t xml:space="preserve">un doppione richiede STESSO importo + STESSA data + STESSA descrizione originale rispetto a una transazione gia nel DB, nella stessa categoria (conto vs conto, carte vs carte).</w:t>
       </w:r>
     </w:p>
     <w:p>
@@ -4325,10 +4427,20 @@
       <w:r>
         <w:rPr>
           <w:rFonts w:ascii="Arial" w:cs="Arial" w:eastAsia="Arial" w:hAnsi="Arial"/>
-          <w:sz w:val="20"/>
-          <w:szCs w:val="20"/>
-        </w:rPr>
-        <w:t xml:space="preserve">Se nessuna regola matcha: cat1 = "Non Categorizzato"</w:t>
+          <w:b/>
+          <w:bCs/>
+          <w:sz w:val="20"/>
+          <w:szCs w:val="20"/>
+        </w:rPr>
+        <w:t xml:space="preserve">Sempre vs DB: </w:t>
+      </w:r>
+      <w:r>
+        <w:rPr>
+          <w:rFonts w:ascii="Arial" w:cs="Arial" w:eastAsia="Arial" w:hAnsi="Arial"/>
+          <w:sz w:val="20"/>
+          <w:szCs w:val="20"/>
+        </w:rPr>
+        <w:t xml:space="preserve">la verifica avviene sempre contro il database, mai contro le altre righe dello stesso import (rimosso il vecchio confronto intra-batch).</w:t>
       </w:r>
     </w:p>
     <w:p>
@@ -4343,10 +4455,45 @@
       <w:r>
         <w:rPr>
           <w:rFonts w:ascii="Arial" w:cs="Arial" w:eastAsia="Arial" w:hAnsi="Arial"/>
-          <w:sz w:val="20"/>
-          <w:szCs w:val="20"/>
-        </w:rPr>
-        <w:t xml:space="preserve">Regola di sistema fondamentale: amount &gt; 0 → cat1 = "Entrate" sempre (sovrascrive tutto)</w:t>
+          <w:b/>
+          <w:bCs/>
+          <w:sz w:val="20"/>
+          <w:szCs w:val="20"/>
+        </w:rPr>
+        <w:t xml:space="preserve">DoppioniStep: </w:t>
+      </w:r>
+      <w:r>
+        <w:rPr>
+          <w:rFonts w:ascii="Arial" w:cs="Arial" w:eastAsia="Arial" w:hAnsi="Arial"/>
+          <w:sz w:val="20"/>
+          <w:szCs w:val="20"/>
+        </w:rPr>
+        <w:t xml:space="preserve">componente definito in ImportWizard.jsx, esportato e riusato in ImportModal (import circolare risolto per hoisting). Vista a due colonne: a sinistra la riga gia nel DB, a destra quella in arrivo dal CSV, per confrontarle prima di eliminarle.</w:t>
+      </w:r>
+    </w:p>
+    <w:p>
+      <w:pPr>
+        <w:spacing w:after="60" w:before="60"/>
+      </w:pPr>
+      <w:r>
+        <w:t xml:space="preserve"/>
+      </w:r>
+    </w:p>
+    <w:p>
+      <w:pPr>
+        <w:pStyle w:val="Heading2"/>
+        <w:spacing w:after="80" w:before="220"/>
+      </w:pPr>
+      <w:r>
+        <w:rPr>
+          <w:rFonts w:ascii="Arial" w:cs="Arial" w:eastAsia="Arial" w:hAnsi="Arial"/>
+          <w:b/>
+          <w:bCs/>
+          <w:color w:val="34495E"/>
+          <w:sz w:val="24"/>
+          <w:szCs w:val="24"/>
+        </w:rPr>
+        <w:t xml:space="preserve">4.5 Rifinitura, compensazioni e riepilogo</w:t>
       </w:r>
     </w:p>
     <w:p>
@@ -4361,45 +4508,20 @@
       <w:r>
         <w:rPr>
           <w:rFonts w:ascii="Arial" w:cs="Arial" w:eastAsia="Arial" w:hAnsi="Arial"/>
-          <w:sz w:val="20"/>
-          <w:szCs w:val="20"/>
-        </w:rPr>
-        <w:t xml:space="preserve">Al primo CSV assoluto: proposta categorizzazione batch con preview prima di confermare</w:t>
-      </w:r>
-    </w:p>
-    <w:p>
-      <w:r>
-        <w:br w:type="page"/>
-      </w:r>
-    </w:p>
-    <w:p>
-      <w:pPr>
-        <w:pStyle w:val="Heading2"/>
-        <w:spacing w:after="80" w:before="220"/>
-      </w:pPr>
-      <w:r>
-        <w:rPr>
-          <w:rFonts w:ascii="Arial" w:cs="Arial" w:eastAsia="Arial" w:hAnsi="Arial"/>
           <w:b/>
           <w:bCs/>
-          <w:color w:val="34495E"/>
-          <w:sz w:val="24"/>
-          <w:szCs w:val="24"/>
-        </w:rPr>
-        <w:t xml:space="preserve">4.6 Wizard Import Unificato (rev. 2026-09)</w:t>
-      </w:r>
-    </w:p>
-    <w:p>
-      <w:pPr>
-        <w:spacing w:after="60" w:before="60"/>
-      </w:pPr>
-      <w:r>
-        <w:rPr>
-          <w:rFonts w:ascii="Arial" w:cs="Arial" w:eastAsia="Arial" w:hAnsi="Arial"/>
-          <w:sz w:val="20"/>
-          <w:szCs w:val="20"/>
-        </w:rPr>
-        <w:t xml:space="preserve">Il modal a singola sorgente descritto in 4.1–4.5 e stato sostituito da un wizard unico (ImportWizard.jsx) che concatena conto, carte e PayPal in un solo flusso guidato, con rifinitura e compensazioni. La schermata iniziale e compatta: tre icone (Conto, Carte, PayPal), senza storico; alla selezione la cornice si allarga ed entra negli step. Ordine sorgenti: Conto -&gt; Carte -&gt; PayPal.</w:t>
+          <w:sz w:val="20"/>
+          <w:szCs w:val="20"/>
+        </w:rPr>
+        <w:t xml:space="preserve">Rifinitura: </w:t>
+      </w:r>
+      <w:r>
+        <w:rPr>
+          <w:rFonts w:ascii="Arial" w:cs="Arial" w:eastAsia="Arial" w:hAnsi="Arial"/>
+          <w:sz w:val="20"/>
+          <w:szCs w:val="20"/>
+        </w:rPr>
+        <w:t xml:space="preserve">dopo l'import di ogni sorgente: schermate per completare la categoria L2, sistemare le descrizioni e verificare le righe categorizzate dall'AI.</w:t>
       </w:r>
     </w:p>
     <w:p>
@@ -4419,15 +4541,15 @@
           <w:sz w:val="20"/>
           <w:szCs w:val="20"/>
         </w:rPr>
-        <w:t xml:space="preserve">Principio doppioni: </w:t>
-      </w:r>
-      <w:r>
-        <w:rPr>
-          <w:rFonts w:ascii="Arial" w:cs="Arial" w:eastAsia="Arial" w:hAnsi="Arial"/>
-          <w:sz w:val="20"/>
-          <w:szCs w:val="20"/>
-        </w:rPr>
-        <w:t xml:space="preserve">un doppione richiede STESSO importo + STESSA data + STESSA descrizione rispetto al database (rimosso il vecchio confronto intra-batch). I doppioni si verificano SEMPRE contro il DB, mai contro le righe dello stesso import.</w:t>
+        <w:t xml:space="preserve">Step comuni finali: </w:t>
+      </w:r>
+      <w:r>
+        <w:rPr>
+          <w:rFonts w:ascii="Arial" w:cs="Arial" w:eastAsia="Arial" w:hAnsi="Arial"/>
+          <w:sz w:val="20"/>
+          <w:szCs w:val="20"/>
+        </w:rPr>
+        <w:t xml:space="preserve">una volta sola e limitati alle sole transazioni di questo import (importedIdSet): Compensazioni -&gt; Vacanze -&gt; Documenti/Ricevute (se presenti) -&gt; Riepilogo Transazioni -&gt; Riepilogo KPI.</w:t>
       </w:r>
     </w:p>
     <w:p>
@@ -4447,15 +4569,15 @@
           <w:sz w:val="20"/>
           <w:szCs w:val="20"/>
         </w:rPr>
-        <w:t xml:space="preserve">Conto (orchestrato dal wizard): </w:t>
-      </w:r>
-      <w:r>
-        <w:rPr>
-          <w:rFonts w:ascii="Arial" w:cs="Arial" w:eastAsia="Arial" w:hAnsi="Arial"/>
-          <w:sz w:val="20"/>
-          <w:szCs w:val="20"/>
-        </w:rPr>
-        <w:t xml:space="preserve">Import (parse, NON salva) -&gt; Anteprima/selezione (checkbox, di default tutte) -&gt; Doppioni (su righe ANCORA NON salvate) -&gt; salvataggio + AI + regole solo sulle righe superstiti. ImportModal riceve la prop onParsed e consegna le righe parsate al wizard; salvataggio/AI/regole sono estratti in src/data/importCommit.js (commitParsedTxs), invocato dopo i doppioni.</w:t>
+        <w:t xml:space="preserve">Riepilogo Transazioni editabile: </w:t>
+      </w:r>
+      <w:r>
+        <w:rPr>
+          <w:rFonts w:ascii="Arial" w:cs="Arial" w:eastAsia="Arial" w:hAnsi="Arial"/>
+          <w:sz w:val="20"/>
+          <w:szCs w:val="20"/>
+        </w:rPr>
+        <w:t xml:space="preserve">categoria L1, sottocategoria L2, descrizione e citta modificabili inline (RefineTable); il pulsante 'Conferma tutto' chiude l'import. Il modello categorie ha DUE livelli (L1/L2): non esiste un L3.</w:t>
       </w:r>
     </w:p>
     <w:p>
@@ -4475,15 +4597,15 @@
           <w:sz w:val="20"/>
           <w:szCs w:val="20"/>
         </w:rPr>
-        <w:t xml:space="preserve">Carte (interno a ImportModal): </w:t>
-      </w:r>
-      <w:r>
-        <w:rPr>
-          <w:rFonts w:ascii="Arial" w:cs="Arial" w:eastAsia="Arial" w:hAnsi="Arial"/>
-          <w:sz w:val="20"/>
-          <w:szCs w:val="20"/>
-        </w:rPr>
-        <w:t xml:space="preserve">Import -&gt; Anteprima -&gt; Riconciliazione mensile (estratti) -&gt; Doppioni PRIMA del salvataggio -&gt; cardFinalCommit (salva i superstiti + esclude gli estratti + verifica saldo invariato con rollback automatico + AI). La rettifica di saldo per-mese e RICALCOLATA sui superstiti dopo i doppioni, cosi il saldo resta invariato anche se si eliminano righe. handleCardReconcileConfirm e diviso in prepare (nel wizard non salva, passa ai doppioni) + cardFinalCommit. Lo standalone (fuori dal wizard) salva subito come prima.</w:t>
+        <w:t xml:space="preserve">Categorizzazione AI e regole: </w:t>
+      </w:r>
+      <w:r>
+        <w:rPr>
+          <w:rFonts w:ascii="Arial" w:cs="Arial" w:eastAsia="Arial" w:hAnsi="Arial"/>
+          <w:sz w:val="20"/>
+          <w:szCs w:val="20"/>
+        </w:rPr>
+        <w:t xml:space="preserve">applyAiRules + regole di sistema (King, multi-condizione, semplici testuali; amount&gt;0 -&gt; Entrate; riassegnazione Weekend e Vacanze per le spese in periodo di vacanza). Rilanciabile in qualsiasi momento da Transazioni con AI Enrichment.</w:t>
       </w:r>
     </w:p>
     <w:p>
@@ -4503,146 +4625,6 @@
           <w:sz w:val="20"/>
           <w:szCs w:val="20"/>
         </w:rPr>
-        <w:t xml:space="preserve">PayPal: </w:t>
-      </w:r>
-      <w:r>
-        <w:rPr>
-          <w:rFonts w:ascii="Arial" w:cs="Arial" w:eastAsia="Arial" w:hAnsi="Arial"/>
-          <w:sz w:val="20"/>
-          <w:szCs w:val="20"/>
-        </w:rPr>
-        <w:t xml:space="preserve">invariato rispetto alla sezione 5 (screenshot/PDF -&gt; abbinamento automatico), integrato come ultimo blocco del wizard.</w:t>
-      </w:r>
-    </w:p>
-    <w:p>
-      <w:pPr>
-        <w:pStyle w:val="ListParagraph"/>
-        <w:numPr>
-          <w:ilvl w:val="0"/>
-          <w:numId w:val="2"/>
-        </w:numPr>
-        <w:spacing w:after="36" w:before="36"/>
-      </w:pPr>
-      <w:r>
-        <w:rPr>
-          <w:rFonts w:ascii="Arial" w:cs="Arial" w:eastAsia="Arial" w:hAnsi="Arial"/>
-          <w:b/>
-          <w:bCs/>
-          <w:sz w:val="20"/>
-          <w:szCs w:val="20"/>
-        </w:rPr>
-        <w:t xml:space="preserve">DoppioniStep: </w:t>
-      </w:r>
-      <w:r>
-        <w:rPr>
-          <w:rFonts w:ascii="Arial" w:cs="Arial" w:eastAsia="Arial" w:hAnsi="Arial"/>
-          <w:sz w:val="20"/>
-          <w:szCs w:val="20"/>
-        </w:rPr>
-        <w:t xml:space="preserve">componente definito in ImportWizard.jsx, ESPORTATO e riusato dentro ImportModal (import circolare risolto per hoisting). Modalita 'unsaved' con callback onCommit. Vista a due colonne: a sinistra la riga gia nel DB, a destra la riga in arrivo dal CSV.</w:t>
-      </w:r>
-    </w:p>
-    <w:p>
-      <w:pPr>
-        <w:pStyle w:val="ListParagraph"/>
-        <w:numPr>
-          <w:ilvl w:val="0"/>
-          <w:numId w:val="2"/>
-        </w:numPr>
-        <w:spacing w:after="36" w:before="36"/>
-      </w:pPr>
-      <w:r>
-        <w:rPr>
-          <w:rFonts w:ascii="Arial" w:cs="Arial" w:eastAsia="Arial" w:hAnsi="Arial"/>
-          <w:b/>
-          <w:bCs/>
-          <w:sz w:val="20"/>
-          <w:szCs w:val="20"/>
-        </w:rPr>
-        <w:t xml:space="preserve">Controllo saldo (solo conto, opzionale): </w:t>
-      </w:r>
-      <w:r>
-        <w:rPr>
-          <w:rFonts w:ascii="Arial" w:cs="Arial" w:eastAsia="Arial" w:hAnsi="Arial"/>
-          <w:sz w:val="20"/>
-          <w:szCs w:val="20"/>
-        </w:rPr>
-        <w:t xml:space="preserve">inserendo il 'nuovo saldo da banca' lo step Doppioni mostra il gap (Saldo post import - nuovo saldo) e non fa proseguire finche non e azzerato. Gli input saldo accettano il formato italiano con la virgola (parseDecimalIT in src/utils/format.js).</w:t>
-      </w:r>
-    </w:p>
-    <w:p>
-      <w:pPr>
-        <w:pStyle w:val="ListParagraph"/>
-        <w:numPr>
-          <w:ilvl w:val="0"/>
-          <w:numId w:val="2"/>
-        </w:numPr>
-        <w:spacing w:after="36" w:before="36"/>
-      </w:pPr>
-      <w:r>
-        <w:rPr>
-          <w:rFonts w:ascii="Arial" w:cs="Arial" w:eastAsia="Arial" w:hAnsi="Arial"/>
-          <w:b/>
-          <w:bCs/>
-          <w:sz w:val="20"/>
-          <w:szCs w:val="20"/>
-        </w:rPr>
-        <w:t xml:space="preserve">Step comuni finali: </w:t>
-      </w:r>
-      <w:r>
-        <w:rPr>
-          <w:rFonts w:ascii="Arial" w:cs="Arial" w:eastAsia="Arial" w:hAnsi="Arial"/>
-          <w:sz w:val="20"/>
-          <w:szCs w:val="20"/>
-        </w:rPr>
-        <w:t xml:space="preserve">una volta sola e limitati alle sole transazioni di questo import (importedIdSet): Compensazioni -&gt; Vacanze -&gt; Documenti/Ricevute (se presenti) -&gt; Riepilogo Transazioni EDITABILE (RefineTable: categoria L1, sottocategoria L2, descrizione e citta modificabili inline, pulsante 'Conferma tutto') -&gt; Riepilogo KPI.</w:t>
-      </w:r>
-    </w:p>
-    <w:p>
-      <w:pPr>
-        <w:pStyle w:val="ListParagraph"/>
-        <w:numPr>
-          <w:ilvl w:val="0"/>
-          <w:numId w:val="2"/>
-        </w:numPr>
-        <w:spacing w:after="36" w:before="36"/>
-      </w:pPr>
-      <w:r>
-        <w:rPr>
-          <w:rFonts w:ascii="Arial" w:cs="Arial" w:eastAsia="Arial" w:hAnsi="Arial"/>
-          <w:b/>
-          <w:bCs/>
-          <w:sz w:val="20"/>
-          <w:szCs w:val="20"/>
-        </w:rPr>
-        <w:t xml:space="preserve">Categorie: </w:t>
-      </w:r>
-      <w:r>
-        <w:rPr>
-          <w:rFonts w:ascii="Arial" w:cs="Arial" w:eastAsia="Arial" w:hAnsi="Arial"/>
-          <w:sz w:val="20"/>
-          <w:szCs w:val="20"/>
-        </w:rPr>
-        <w:t xml:space="preserve">modello a DUE livelli (L1 = cat1, L2 = cat2/sub in src/data/categories.js). Non esiste un terzo livello L3.</w:t>
-      </w:r>
-    </w:p>
-    <w:p>
-      <w:pPr>
-        <w:pStyle w:val="ListParagraph"/>
-        <w:numPr>
-          <w:ilvl w:val="0"/>
-          <w:numId w:val="2"/>
-        </w:numPr>
-        <w:spacing w:after="36" w:before="36"/>
-      </w:pPr>
-      <w:r>
-        <w:rPr>
-          <w:rFonts w:ascii="Arial" w:cs="Arial" w:eastAsia="Arial" w:hAnsi="Arial"/>
-          <w:b/>
-          <w:bCs/>
-          <w:sz w:val="20"/>
-          <w:szCs w:val="20"/>
-        </w:rPr>
         <w:t xml:space="preserve">Undo: </w:t>
       </w:r>
       <w:r>
@@ -4651,7 +4633,7 @@
           <w:sz w:val="20"/>
           <w:szCs w:val="20"/>
         </w:rPr>
-        <w:t xml:space="preserve">ogni import e un'unica voce nello stack (beginTxUndoBatch/commitTxUndoBatch); chiudere il wizard a meta annulla per intero l'import della sessione. Nulla viene salvato prima dei doppioni.</w:t>
+        <w:t xml:space="preserve">ogni import e un'unica voce nello stack (beginTxUndoBatch/commitTxUndoBatch); chiudere il wizard a meta annulla l'intero import della sessione. Nulla viene salvato prima dei doppioni.</w:t>
       </w:r>
     </w:p>
     <w:p>

</xml_diff>